<commit_message>
Mise à jour du document de cadrage et ajout du compte rendu de réunion
</commit_message>
<xml_diff>
--- a/cadrage/KWISMO_Document_de_Cadrage.docx
+++ b/cadrage/KWISMO_Document_de_Cadrage.docx
@@ -12,7 +12,7 @@
           <w:noProof/>
         </w:rPr>
         <w:drawing>
-          <wp:inline distT="0" distB="0" distL="0" distR="0" wp14:anchorId="1607516F" wp14:editId="31CBD289">
+          <wp:inline distT="0" distB="0" distL="0" distR="0" wp14:anchorId="1607516F" wp14:editId="1D93CF34">
             <wp:extent cx="1238250" cy="1238250"/>
             <wp:effectExtent l="0" t="0" r="0" b="0"/>
             <wp:docPr id="1" name="Image 1"/>
@@ -23,14 +23,19 @@
               <a:graphicData uri="http://schemas.openxmlformats.org/drawingml/2006/picture">
                 <pic:pic xmlns:pic="http://schemas.openxmlformats.org/drawingml/2006/picture">
                   <pic:nvPicPr>
-                    <pic:cNvPr id="0" name=""/>
+                    <pic:cNvPr id="1" name="Image 1"/>
                     <pic:cNvPicPr>
                       <a:picLocks noChangeAspect="1" noChangeArrowheads="1"/>
                     </pic:cNvPicPr>
                   </pic:nvPicPr>
                   <pic:blipFill>
-                    <a:blip r:embed="rId7"/>
-                    <a:srcRect/>
+                    <a:blip r:embed="rId7" cstate="print">
+                      <a:extLst>
+                        <a:ext uri="{28A0092B-C50C-407E-A947-70E740481C1C}">
+                          <a14:useLocalDpi xmlns:a14="http://schemas.microsoft.com/office/drawing/2010/main" val="0"/>
+                        </a:ext>
+                      </a:extLst>
+                    </a:blip>
                     <a:stretch>
                       <a:fillRect/>
                     </a:stretch>
@@ -140,7 +145,17 @@
           <w:sz w:val="26"/>
           <w:szCs w:val="26"/>
         </w:rPr>
-        <w:t>Orange Cameroun</w:t>
+        <w:t xml:space="preserve">Orange </w:t>
+      </w:r>
+      <w:r>
+        <w:rPr>
+          <w:b/>
+          <w:bCs/>
+          <w:color w:val="F6A020"/>
+          <w:sz w:val="26"/>
+          <w:szCs w:val="26"/>
+        </w:rPr>
+        <w:t>Digital Center</w:t>
       </w:r>
     </w:p>
     <w:p>
@@ -210,7 +225,7 @@
         </w:pBdr>
         <w:spacing w:before="400" w:after="200"/>
       </w:pPr>
-      <w:bookmarkStart w:id="0" w:name="_Toc236664383"/>
+      <w:bookmarkStart w:id="0" w:name="_Toc237035999"/>
       <w:r>
         <w:rPr>
           <w:b/>
@@ -235,7 +250,12 @@
               <w:tab w:val="right" w:leader="dot" w:pos="9696"/>
             </w:tabs>
             <w:rPr>
+              <w:rFonts w:asciiTheme="minorHAnsi" w:eastAsiaTheme="minorEastAsia" w:hAnsiTheme="minorHAnsi" w:cstheme="minorBidi"/>
               <w:noProof/>
+              <w:kern w:val="2"/>
+              <w:sz w:val="24"/>
+              <w:szCs w:val="24"/>
+              <w14:ligatures w14:val="standardContextual"/>
             </w:rPr>
           </w:pPr>
           <w:r>
@@ -247,7 +267,7 @@
           <w:r>
             <w:fldChar w:fldCharType="separate"/>
           </w:r>
-          <w:hyperlink w:anchor="_Toc236664383" w:history="1">
+          <w:hyperlink w:anchor="_Toc237035999" w:history="1">
             <w:r>
               <w:rPr>
                 <w:rStyle w:val="Lienhypertexte"/>
@@ -273,7 +293,7 @@
               <w:rPr>
                 <w:noProof/>
               </w:rPr>
-              <w:instrText xml:space="preserve"> PAGEREF _Toc236664383 \h </w:instrText>
+              <w:instrText xml:space="preserve"> PAGEREF _Toc237035999 \h </w:instrText>
             </w:r>
             <w:r>
               <w:rPr>
@@ -307,10 +327,15 @@
               <w:tab w:val="right" w:leader="dot" w:pos="9696"/>
             </w:tabs>
             <w:rPr>
+              <w:rFonts w:asciiTheme="minorHAnsi" w:eastAsiaTheme="minorEastAsia" w:hAnsiTheme="minorHAnsi" w:cstheme="minorBidi"/>
               <w:noProof/>
+              <w:kern w:val="2"/>
+              <w:sz w:val="24"/>
+              <w:szCs w:val="24"/>
+              <w14:ligatures w14:val="standardContextual"/>
             </w:rPr>
           </w:pPr>
-          <w:hyperlink w:anchor="_Toc236664384" w:history="1">
+          <w:hyperlink w:anchor="_Toc237036000" w:history="1">
             <w:r>
               <w:rPr>
                 <w:rStyle w:val="Lienhypertexte"/>
@@ -336,7 +361,7 @@
               <w:rPr>
                 <w:noProof/>
               </w:rPr>
-              <w:instrText xml:space="preserve"> PAGEREF _Toc236664384 \h </w:instrText>
+              <w:instrText xml:space="preserve"> PAGEREF _Toc237036000 \h </w:instrText>
             </w:r>
             <w:r>
               <w:rPr>
@@ -370,10 +395,15 @@
               <w:tab w:val="right" w:leader="dot" w:pos="9696"/>
             </w:tabs>
             <w:rPr>
+              <w:rFonts w:asciiTheme="minorHAnsi" w:eastAsiaTheme="minorEastAsia" w:hAnsiTheme="minorHAnsi" w:cstheme="minorBidi"/>
               <w:noProof/>
+              <w:kern w:val="2"/>
+              <w:sz w:val="24"/>
+              <w:szCs w:val="24"/>
+              <w14:ligatures w14:val="standardContextual"/>
             </w:rPr>
           </w:pPr>
-          <w:hyperlink w:anchor="_Toc236664385" w:history="1">
+          <w:hyperlink w:anchor="_Toc237036001" w:history="1">
             <w:r>
               <w:rPr>
                 <w:rStyle w:val="Lienhypertexte"/>
@@ -399,7 +429,7 @@
               <w:rPr>
                 <w:noProof/>
               </w:rPr>
-              <w:instrText xml:space="preserve"> PAGEREF _Toc236664385 \h </w:instrText>
+              <w:instrText xml:space="preserve"> PAGEREF _Toc237036001 \h </w:instrText>
             </w:r>
             <w:r>
               <w:rPr>
@@ -433,10 +463,15 @@
               <w:tab w:val="right" w:leader="dot" w:pos="9696"/>
             </w:tabs>
             <w:rPr>
+              <w:rFonts w:asciiTheme="minorHAnsi" w:eastAsiaTheme="minorEastAsia" w:hAnsiTheme="minorHAnsi" w:cstheme="minorBidi"/>
               <w:noProof/>
+              <w:kern w:val="2"/>
+              <w:sz w:val="24"/>
+              <w:szCs w:val="24"/>
+              <w14:ligatures w14:val="standardContextual"/>
             </w:rPr>
           </w:pPr>
-          <w:hyperlink w:anchor="_Toc236664386" w:history="1">
+          <w:hyperlink w:anchor="_Toc237036002" w:history="1">
             <w:r>
               <w:rPr>
                 <w:rStyle w:val="Lienhypertexte"/>
@@ -462,7 +497,7 @@
               <w:rPr>
                 <w:noProof/>
               </w:rPr>
-              <w:instrText xml:space="preserve"> PAGEREF _Toc236664386 \h </w:instrText>
+              <w:instrText xml:space="preserve"> PAGEREF _Toc237036002 \h </w:instrText>
             </w:r>
             <w:r>
               <w:rPr>
@@ -496,10 +531,15 @@
               <w:tab w:val="right" w:leader="dot" w:pos="9696"/>
             </w:tabs>
             <w:rPr>
+              <w:rFonts w:asciiTheme="minorHAnsi" w:eastAsiaTheme="minorEastAsia" w:hAnsiTheme="minorHAnsi" w:cstheme="minorBidi"/>
               <w:noProof/>
+              <w:kern w:val="2"/>
+              <w:sz w:val="24"/>
+              <w:szCs w:val="24"/>
+              <w14:ligatures w14:val="standardContextual"/>
             </w:rPr>
           </w:pPr>
-          <w:hyperlink w:anchor="_Toc236664387" w:history="1">
+          <w:hyperlink w:anchor="_Toc237036003" w:history="1">
             <w:r>
               <w:rPr>
                 <w:rStyle w:val="Lienhypertexte"/>
@@ -525,7 +565,7 @@
               <w:rPr>
                 <w:noProof/>
               </w:rPr>
-              <w:instrText xml:space="preserve"> PAGEREF _Toc236664387 \h </w:instrText>
+              <w:instrText xml:space="preserve"> PAGEREF _Toc237036003 \h </w:instrText>
             </w:r>
             <w:r>
               <w:rPr>
@@ -559,10 +599,15 @@
               <w:tab w:val="right" w:leader="dot" w:pos="9696"/>
             </w:tabs>
             <w:rPr>
+              <w:rFonts w:asciiTheme="minorHAnsi" w:eastAsiaTheme="minorEastAsia" w:hAnsiTheme="minorHAnsi" w:cstheme="minorBidi"/>
               <w:noProof/>
+              <w:kern w:val="2"/>
+              <w:sz w:val="24"/>
+              <w:szCs w:val="24"/>
+              <w14:ligatures w14:val="standardContextual"/>
             </w:rPr>
           </w:pPr>
-          <w:hyperlink w:anchor="_Toc236664388" w:history="1">
+          <w:hyperlink w:anchor="_Toc237036004" w:history="1">
             <w:r>
               <w:rPr>
                 <w:rStyle w:val="Lienhypertexte"/>
@@ -588,7 +633,7 @@
               <w:rPr>
                 <w:noProof/>
               </w:rPr>
-              <w:instrText xml:space="preserve"> PAGEREF _Toc236664388 \h </w:instrText>
+              <w:instrText xml:space="preserve"> PAGEREF _Toc237036004 \h </w:instrText>
             </w:r>
             <w:r>
               <w:rPr>
@@ -622,10 +667,15 @@
               <w:tab w:val="right" w:leader="dot" w:pos="9696"/>
             </w:tabs>
             <w:rPr>
+              <w:rFonts w:asciiTheme="minorHAnsi" w:eastAsiaTheme="minorEastAsia" w:hAnsiTheme="minorHAnsi" w:cstheme="minorBidi"/>
               <w:noProof/>
+              <w:kern w:val="2"/>
+              <w:sz w:val="24"/>
+              <w:szCs w:val="24"/>
+              <w14:ligatures w14:val="standardContextual"/>
             </w:rPr>
           </w:pPr>
-          <w:hyperlink w:anchor="_Toc236664389" w:history="1">
+          <w:hyperlink w:anchor="_Toc237036005" w:history="1">
             <w:r>
               <w:rPr>
                 <w:rStyle w:val="Lienhypertexte"/>
@@ -651,7 +701,7 @@
               <w:rPr>
                 <w:noProof/>
               </w:rPr>
-              <w:instrText xml:space="preserve"> PAGEREF _Toc236664389 \h </w:instrText>
+              <w:instrText xml:space="preserve"> PAGEREF _Toc237036005 \h </w:instrText>
             </w:r>
             <w:r>
               <w:rPr>
@@ -685,10 +735,15 @@
               <w:tab w:val="right" w:leader="dot" w:pos="9696"/>
             </w:tabs>
             <w:rPr>
+              <w:rFonts w:asciiTheme="minorHAnsi" w:eastAsiaTheme="minorEastAsia" w:hAnsiTheme="minorHAnsi" w:cstheme="minorBidi"/>
               <w:noProof/>
+              <w:kern w:val="2"/>
+              <w:sz w:val="24"/>
+              <w:szCs w:val="24"/>
+              <w14:ligatures w14:val="standardContextual"/>
             </w:rPr>
           </w:pPr>
-          <w:hyperlink w:anchor="_Toc236664390" w:history="1">
+          <w:hyperlink w:anchor="_Toc237036006" w:history="1">
             <w:r>
               <w:rPr>
                 <w:rStyle w:val="Lienhypertexte"/>
@@ -714,7 +769,7 @@
               <w:rPr>
                 <w:noProof/>
               </w:rPr>
-              <w:instrText xml:space="preserve"> PAGEREF _Toc236664390 \h </w:instrText>
+              <w:instrText xml:space="preserve"> PAGEREF _Toc237036006 \h </w:instrText>
             </w:r>
             <w:r>
               <w:rPr>
@@ -748,10 +803,15 @@
               <w:tab w:val="right" w:leader="dot" w:pos="9696"/>
             </w:tabs>
             <w:rPr>
+              <w:rFonts w:asciiTheme="minorHAnsi" w:eastAsiaTheme="minorEastAsia" w:hAnsiTheme="minorHAnsi" w:cstheme="minorBidi"/>
               <w:noProof/>
+              <w:kern w:val="2"/>
+              <w:sz w:val="24"/>
+              <w:szCs w:val="24"/>
+              <w14:ligatures w14:val="standardContextual"/>
             </w:rPr>
           </w:pPr>
-          <w:hyperlink w:anchor="_Toc236664391" w:history="1">
+          <w:hyperlink w:anchor="_Toc237036007" w:history="1">
             <w:r>
               <w:rPr>
                 <w:rStyle w:val="Lienhypertexte"/>
@@ -777,7 +837,7 @@
               <w:rPr>
                 <w:noProof/>
               </w:rPr>
-              <w:instrText xml:space="preserve"> PAGEREF _Toc236664391 \h </w:instrText>
+              <w:instrText xml:space="preserve"> PAGEREF _Toc237036007 \h </w:instrText>
             </w:r>
             <w:r>
               <w:rPr>
@@ -811,10 +871,15 @@
               <w:tab w:val="right" w:leader="dot" w:pos="9696"/>
             </w:tabs>
             <w:rPr>
+              <w:rFonts w:asciiTheme="minorHAnsi" w:eastAsiaTheme="minorEastAsia" w:hAnsiTheme="minorHAnsi" w:cstheme="minorBidi"/>
               <w:noProof/>
+              <w:kern w:val="2"/>
+              <w:sz w:val="24"/>
+              <w:szCs w:val="24"/>
+              <w14:ligatures w14:val="standardContextual"/>
             </w:rPr>
           </w:pPr>
-          <w:hyperlink w:anchor="_Toc236664392" w:history="1">
+          <w:hyperlink w:anchor="_Toc237036008" w:history="1">
             <w:r>
               <w:rPr>
                 <w:rStyle w:val="Lienhypertexte"/>
@@ -840,7 +905,7 @@
               <w:rPr>
                 <w:noProof/>
               </w:rPr>
-              <w:instrText xml:space="preserve"> PAGEREF _Toc236664392 \h </w:instrText>
+              <w:instrText xml:space="preserve"> PAGEREF _Toc237036008 \h </w:instrText>
             </w:r>
             <w:r>
               <w:rPr>
@@ -874,10 +939,15 @@
               <w:tab w:val="right" w:leader="dot" w:pos="9696"/>
             </w:tabs>
             <w:rPr>
+              <w:rFonts w:asciiTheme="minorHAnsi" w:eastAsiaTheme="minorEastAsia" w:hAnsiTheme="minorHAnsi" w:cstheme="minorBidi"/>
               <w:noProof/>
+              <w:kern w:val="2"/>
+              <w:sz w:val="24"/>
+              <w:szCs w:val="24"/>
+              <w14:ligatures w14:val="standardContextual"/>
             </w:rPr>
           </w:pPr>
-          <w:hyperlink w:anchor="_Toc236664393" w:history="1">
+          <w:hyperlink w:anchor="_Toc237036009" w:history="1">
             <w:r>
               <w:rPr>
                 <w:rStyle w:val="Lienhypertexte"/>
@@ -903,7 +973,7 @@
               <w:rPr>
                 <w:noProof/>
               </w:rPr>
-              <w:instrText xml:space="preserve"> PAGEREF _Toc236664393 \h </w:instrText>
+              <w:instrText xml:space="preserve"> PAGEREF _Toc237036009 \h </w:instrText>
             </w:r>
             <w:r>
               <w:rPr>
@@ -937,10 +1007,15 @@
               <w:tab w:val="right" w:leader="dot" w:pos="9696"/>
             </w:tabs>
             <w:rPr>
+              <w:rFonts w:asciiTheme="minorHAnsi" w:eastAsiaTheme="minorEastAsia" w:hAnsiTheme="minorHAnsi" w:cstheme="minorBidi"/>
               <w:noProof/>
+              <w:kern w:val="2"/>
+              <w:sz w:val="24"/>
+              <w:szCs w:val="24"/>
+              <w14:ligatures w14:val="standardContextual"/>
             </w:rPr>
           </w:pPr>
-          <w:hyperlink w:anchor="_Toc236664394" w:history="1">
+          <w:hyperlink w:anchor="_Toc237036010" w:history="1">
             <w:r>
               <w:rPr>
                 <w:rStyle w:val="Lienhypertexte"/>
@@ -966,7 +1041,7 @@
               <w:rPr>
                 <w:noProof/>
               </w:rPr>
-              <w:instrText xml:space="preserve"> PAGEREF _Toc236664394 \h </w:instrText>
+              <w:instrText xml:space="preserve"> PAGEREF _Toc237036010 \h </w:instrText>
             </w:r>
             <w:r>
               <w:rPr>
@@ -983,7 +1058,7 @@
               <w:rPr>
                 <w:noProof/>
               </w:rPr>
-              <w:t>8</w:t>
+              <w:t>9</w:t>
             </w:r>
             <w:r>
               <w:rPr>
@@ -1000,10 +1075,15 @@
               <w:tab w:val="right" w:leader="dot" w:pos="9696"/>
             </w:tabs>
             <w:rPr>
+              <w:rFonts w:asciiTheme="minorHAnsi" w:eastAsiaTheme="minorEastAsia" w:hAnsiTheme="minorHAnsi" w:cstheme="minorBidi"/>
               <w:noProof/>
+              <w:kern w:val="2"/>
+              <w:sz w:val="24"/>
+              <w:szCs w:val="24"/>
+              <w14:ligatures w14:val="standardContextual"/>
             </w:rPr>
           </w:pPr>
-          <w:hyperlink w:anchor="_Toc236664395" w:history="1">
+          <w:hyperlink w:anchor="_Toc237036011" w:history="1">
             <w:r>
               <w:rPr>
                 <w:rStyle w:val="Lienhypertexte"/>
@@ -1029,7 +1109,7 @@
               <w:rPr>
                 <w:noProof/>
               </w:rPr>
-              <w:instrText xml:space="preserve"> PAGEREF _Toc236664395 \h </w:instrText>
+              <w:instrText xml:space="preserve"> PAGEREF _Toc237036011 \h </w:instrText>
             </w:r>
             <w:r>
               <w:rPr>
@@ -1046,7 +1126,7 @@
               <w:rPr>
                 <w:noProof/>
               </w:rPr>
-              <w:t>8</w:t>
+              <w:t>9</w:t>
             </w:r>
             <w:r>
               <w:rPr>
@@ -1063,10 +1143,15 @@
               <w:tab w:val="right" w:leader="dot" w:pos="9696"/>
             </w:tabs>
             <w:rPr>
+              <w:rFonts w:asciiTheme="minorHAnsi" w:eastAsiaTheme="minorEastAsia" w:hAnsiTheme="minorHAnsi" w:cstheme="minorBidi"/>
               <w:noProof/>
+              <w:kern w:val="2"/>
+              <w:sz w:val="24"/>
+              <w:szCs w:val="24"/>
+              <w14:ligatures w14:val="standardContextual"/>
             </w:rPr>
           </w:pPr>
-          <w:hyperlink w:anchor="_Toc236664396" w:history="1">
+          <w:hyperlink w:anchor="_Toc237036012" w:history="1">
             <w:r>
               <w:rPr>
                 <w:rStyle w:val="Lienhypertexte"/>
@@ -1092,7 +1177,7 @@
               <w:rPr>
                 <w:noProof/>
               </w:rPr>
-              <w:instrText xml:space="preserve"> PAGEREF _Toc236664396 \h </w:instrText>
+              <w:instrText xml:space="preserve"> PAGEREF _Toc237036012 \h </w:instrText>
             </w:r>
             <w:r>
               <w:rPr>
@@ -1109,7 +1194,7 @@
               <w:rPr>
                 <w:noProof/>
               </w:rPr>
-              <w:t>8</w:t>
+              <w:t>9</w:t>
             </w:r>
             <w:r>
               <w:rPr>
@@ -1126,10 +1211,15 @@
               <w:tab w:val="right" w:leader="dot" w:pos="9696"/>
             </w:tabs>
             <w:rPr>
+              <w:rFonts w:asciiTheme="minorHAnsi" w:eastAsiaTheme="minorEastAsia" w:hAnsiTheme="minorHAnsi" w:cstheme="minorBidi"/>
               <w:noProof/>
+              <w:kern w:val="2"/>
+              <w:sz w:val="24"/>
+              <w:szCs w:val="24"/>
+              <w14:ligatures w14:val="standardContextual"/>
             </w:rPr>
           </w:pPr>
-          <w:hyperlink w:anchor="_Toc236664397" w:history="1">
+          <w:hyperlink w:anchor="_Toc237036013" w:history="1">
             <w:r>
               <w:rPr>
                 <w:rStyle w:val="Lienhypertexte"/>
@@ -1155,7 +1245,7 @@
               <w:rPr>
                 <w:noProof/>
               </w:rPr>
-              <w:instrText xml:space="preserve"> PAGEREF _Toc236664397 \h </w:instrText>
+              <w:instrText xml:space="preserve"> PAGEREF _Toc237036013 \h </w:instrText>
             </w:r>
             <w:r>
               <w:rPr>
@@ -1172,7 +1262,7 @@
               <w:rPr>
                 <w:noProof/>
               </w:rPr>
-              <w:t>9</w:t>
+              <w:t>10</w:t>
             </w:r>
             <w:r>
               <w:rPr>
@@ -1189,10 +1279,15 @@
               <w:tab w:val="right" w:leader="dot" w:pos="9696"/>
             </w:tabs>
             <w:rPr>
+              <w:rFonts w:asciiTheme="minorHAnsi" w:eastAsiaTheme="minorEastAsia" w:hAnsiTheme="minorHAnsi" w:cstheme="minorBidi"/>
               <w:noProof/>
+              <w:kern w:val="2"/>
+              <w:sz w:val="24"/>
+              <w:szCs w:val="24"/>
+              <w14:ligatures w14:val="standardContextual"/>
             </w:rPr>
           </w:pPr>
-          <w:hyperlink w:anchor="_Toc236664398" w:history="1">
+          <w:hyperlink w:anchor="_Toc237036014" w:history="1">
             <w:r>
               <w:rPr>
                 <w:rStyle w:val="Lienhypertexte"/>
@@ -1218,7 +1313,7 @@
               <w:rPr>
                 <w:noProof/>
               </w:rPr>
-              <w:instrText xml:space="preserve"> PAGEREF _Toc236664398 \h </w:instrText>
+              <w:instrText xml:space="preserve"> PAGEREF _Toc237036014 \h </w:instrText>
             </w:r>
             <w:r>
               <w:rPr>
@@ -1235,7 +1330,7 @@
               <w:rPr>
                 <w:noProof/>
               </w:rPr>
-              <w:t>9</w:t>
+              <w:t>10</w:t>
             </w:r>
             <w:r>
               <w:rPr>
@@ -1252,10 +1347,15 @@
               <w:tab w:val="right" w:leader="dot" w:pos="9696"/>
             </w:tabs>
             <w:rPr>
+              <w:rFonts w:asciiTheme="minorHAnsi" w:eastAsiaTheme="minorEastAsia" w:hAnsiTheme="minorHAnsi" w:cstheme="minorBidi"/>
               <w:noProof/>
+              <w:kern w:val="2"/>
+              <w:sz w:val="24"/>
+              <w:szCs w:val="24"/>
+              <w14:ligatures w14:val="standardContextual"/>
             </w:rPr>
           </w:pPr>
-          <w:hyperlink w:anchor="_Toc236664399" w:history="1">
+          <w:hyperlink w:anchor="_Toc237036015" w:history="1">
             <w:r>
               <w:rPr>
                 <w:rStyle w:val="Lienhypertexte"/>
@@ -1281,7 +1381,7 @@
               <w:rPr>
                 <w:noProof/>
               </w:rPr>
-              <w:instrText xml:space="preserve"> PAGEREF _Toc236664399 \h </w:instrText>
+              <w:instrText xml:space="preserve"> PAGEREF _Toc237036015 \h </w:instrText>
             </w:r>
             <w:r>
               <w:rPr>
@@ -1298,7 +1398,75 @@
               <w:rPr>
                 <w:noProof/>
               </w:rPr>
-              <w:t>9</w:t>
+              <w:t>10</w:t>
+            </w:r>
+            <w:r>
+              <w:rPr>
+                <w:noProof/>
+              </w:rPr>
+              <w:fldChar w:fldCharType="end"/>
+            </w:r>
+          </w:hyperlink>
+        </w:p>
+        <w:p>
+          <w:pPr>
+            <w:pStyle w:val="TM1"/>
+            <w:tabs>
+              <w:tab w:val="right" w:leader="dot" w:pos="9696"/>
+            </w:tabs>
+            <w:rPr>
+              <w:rFonts w:asciiTheme="minorHAnsi" w:eastAsiaTheme="minorEastAsia" w:hAnsiTheme="minorHAnsi" w:cstheme="minorBidi"/>
+              <w:noProof/>
+              <w:kern w:val="2"/>
+              <w:sz w:val="24"/>
+              <w:szCs w:val="24"/>
+              <w14:ligatures w14:val="standardContextual"/>
+            </w:rPr>
+          </w:pPr>
+          <w:hyperlink w:anchor="_Toc237036016" w:history="1">
+            <w:r>
+              <w:rPr>
+                <w:rStyle w:val="Lienhypertexte"/>
+                <w:b/>
+                <w:bCs/>
+                <w:noProof/>
+              </w:rPr>
+              <w:t>7. Livrables attendus</w:t>
+            </w:r>
+            <w:r>
+              <w:rPr>
+                <w:noProof/>
+              </w:rPr>
+              <w:tab/>
+            </w:r>
+            <w:r>
+              <w:rPr>
+                <w:noProof/>
+              </w:rPr>
+              <w:fldChar w:fldCharType="begin"/>
+            </w:r>
+            <w:r>
+              <w:rPr>
+                <w:noProof/>
+              </w:rPr>
+              <w:instrText xml:space="preserve"> PAGEREF _Toc237036016 \h </w:instrText>
+            </w:r>
+            <w:r>
+              <w:rPr>
+                <w:noProof/>
+              </w:rPr>
+            </w:r>
+            <w:r>
+              <w:rPr>
+                <w:noProof/>
+              </w:rPr>
+              <w:fldChar w:fldCharType="separate"/>
+            </w:r>
+            <w:r>
+              <w:rPr>
+                <w:noProof/>
+              </w:rPr>
+              <w:t>11</w:t>
             </w:r>
             <w:r>
               <w:rPr>
@@ -1315,10 +1483,15 @@
               <w:tab w:val="right" w:leader="dot" w:pos="9696"/>
             </w:tabs>
             <w:rPr>
+              <w:rFonts w:asciiTheme="minorHAnsi" w:eastAsiaTheme="minorEastAsia" w:hAnsiTheme="minorHAnsi" w:cstheme="minorBidi"/>
               <w:noProof/>
+              <w:kern w:val="2"/>
+              <w:sz w:val="24"/>
+              <w:szCs w:val="24"/>
+              <w14:ligatures w14:val="standardContextual"/>
             </w:rPr>
           </w:pPr>
-          <w:hyperlink w:anchor="_Toc236664400" w:history="1">
+          <w:hyperlink w:anchor="_Toc237036017" w:history="1">
             <w:r>
               <w:rPr>
                 <w:rStyle w:val="Lienhypertexte"/>
@@ -1326,7 +1499,7 @@
                 <w:bCs/>
                 <w:noProof/>
               </w:rPr>
-              <w:t>6.3 Modèle économique envisagé</w:t>
+              <w:t>7.1 Conception &amp; maquette</w:t>
             </w:r>
             <w:r>
               <w:rPr>
@@ -1344,7 +1517,7 @@
               <w:rPr>
                 <w:noProof/>
               </w:rPr>
-              <w:instrText xml:space="preserve"> PAGEREF _Toc236664400 \h </w:instrText>
+              <w:instrText xml:space="preserve"> PAGEREF _Toc237036017 \h </w:instrText>
             </w:r>
             <w:r>
               <w:rPr>
@@ -1361,7 +1534,279 @@
               <w:rPr>
                 <w:noProof/>
               </w:rPr>
-              <w:t>9</w:t>
+              <w:t>11</w:t>
+            </w:r>
+            <w:r>
+              <w:rPr>
+                <w:noProof/>
+              </w:rPr>
+              <w:fldChar w:fldCharType="end"/>
+            </w:r>
+          </w:hyperlink>
+        </w:p>
+        <w:p>
+          <w:pPr>
+            <w:pStyle w:val="TM2"/>
+            <w:tabs>
+              <w:tab w:val="right" w:leader="dot" w:pos="9696"/>
+            </w:tabs>
+            <w:rPr>
+              <w:rFonts w:asciiTheme="minorHAnsi" w:eastAsiaTheme="minorEastAsia" w:hAnsiTheme="minorHAnsi" w:cstheme="minorBidi"/>
+              <w:noProof/>
+              <w:kern w:val="2"/>
+              <w:sz w:val="24"/>
+              <w:szCs w:val="24"/>
+              <w14:ligatures w14:val="standardContextual"/>
+            </w:rPr>
+          </w:pPr>
+          <w:hyperlink w:anchor="_Toc237036018" w:history="1">
+            <w:r>
+              <w:rPr>
+                <w:rStyle w:val="Lienhypertexte"/>
+                <w:b/>
+                <w:bCs/>
+                <w:noProof/>
+              </w:rPr>
+              <w:t>7.2 Backend</w:t>
+            </w:r>
+            <w:r>
+              <w:rPr>
+                <w:noProof/>
+              </w:rPr>
+              <w:tab/>
+            </w:r>
+            <w:r>
+              <w:rPr>
+                <w:noProof/>
+              </w:rPr>
+              <w:fldChar w:fldCharType="begin"/>
+            </w:r>
+            <w:r>
+              <w:rPr>
+                <w:noProof/>
+              </w:rPr>
+              <w:instrText xml:space="preserve"> PAGEREF _Toc237036018 \h </w:instrText>
+            </w:r>
+            <w:r>
+              <w:rPr>
+                <w:noProof/>
+              </w:rPr>
+            </w:r>
+            <w:r>
+              <w:rPr>
+                <w:noProof/>
+              </w:rPr>
+              <w:fldChar w:fldCharType="separate"/>
+            </w:r>
+            <w:r>
+              <w:rPr>
+                <w:noProof/>
+              </w:rPr>
+              <w:t>11</w:t>
+            </w:r>
+            <w:r>
+              <w:rPr>
+                <w:noProof/>
+              </w:rPr>
+              <w:fldChar w:fldCharType="end"/>
+            </w:r>
+          </w:hyperlink>
+        </w:p>
+        <w:p>
+          <w:pPr>
+            <w:pStyle w:val="TM2"/>
+            <w:tabs>
+              <w:tab w:val="right" w:leader="dot" w:pos="9696"/>
+            </w:tabs>
+            <w:rPr>
+              <w:rFonts w:asciiTheme="minorHAnsi" w:eastAsiaTheme="minorEastAsia" w:hAnsiTheme="minorHAnsi" w:cstheme="minorBidi"/>
+              <w:noProof/>
+              <w:kern w:val="2"/>
+              <w:sz w:val="24"/>
+              <w:szCs w:val="24"/>
+              <w14:ligatures w14:val="standardContextual"/>
+            </w:rPr>
+          </w:pPr>
+          <w:hyperlink w:anchor="_Toc237036019" w:history="1">
+            <w:r>
+              <w:rPr>
+                <w:rStyle w:val="Lienhypertexte"/>
+                <w:b/>
+                <w:bCs/>
+                <w:noProof/>
+              </w:rPr>
+              <w:t>7.3 Modèle IA</w:t>
+            </w:r>
+            <w:r>
+              <w:rPr>
+                <w:noProof/>
+              </w:rPr>
+              <w:tab/>
+            </w:r>
+            <w:r>
+              <w:rPr>
+                <w:noProof/>
+              </w:rPr>
+              <w:fldChar w:fldCharType="begin"/>
+            </w:r>
+            <w:r>
+              <w:rPr>
+                <w:noProof/>
+              </w:rPr>
+              <w:instrText xml:space="preserve"> PAGEREF _Toc237036019 \h </w:instrText>
+            </w:r>
+            <w:r>
+              <w:rPr>
+                <w:noProof/>
+              </w:rPr>
+            </w:r>
+            <w:r>
+              <w:rPr>
+                <w:noProof/>
+              </w:rPr>
+              <w:fldChar w:fldCharType="separate"/>
+            </w:r>
+            <w:r>
+              <w:rPr>
+                <w:noProof/>
+              </w:rPr>
+              <w:t>11</w:t>
+            </w:r>
+            <w:r>
+              <w:rPr>
+                <w:noProof/>
+              </w:rPr>
+              <w:fldChar w:fldCharType="end"/>
+            </w:r>
+          </w:hyperlink>
+        </w:p>
+        <w:p>
+          <w:pPr>
+            <w:pStyle w:val="TM2"/>
+            <w:tabs>
+              <w:tab w:val="right" w:leader="dot" w:pos="9696"/>
+            </w:tabs>
+            <w:rPr>
+              <w:rFonts w:asciiTheme="minorHAnsi" w:eastAsiaTheme="minorEastAsia" w:hAnsiTheme="minorHAnsi" w:cstheme="minorBidi"/>
+              <w:noProof/>
+              <w:kern w:val="2"/>
+              <w:sz w:val="24"/>
+              <w:szCs w:val="24"/>
+              <w14:ligatures w14:val="standardContextual"/>
+            </w:rPr>
+          </w:pPr>
+          <w:hyperlink w:anchor="_Toc237036020" w:history="1">
+            <w:r>
+              <w:rPr>
+                <w:rStyle w:val="Lienhypertexte"/>
+                <w:b/>
+                <w:bCs/>
+                <w:noProof/>
+              </w:rPr>
+              <w:t>7.4 Application Web</w:t>
+            </w:r>
+            <w:r>
+              <w:rPr>
+                <w:noProof/>
+              </w:rPr>
+              <w:tab/>
+            </w:r>
+            <w:r>
+              <w:rPr>
+                <w:noProof/>
+              </w:rPr>
+              <w:fldChar w:fldCharType="begin"/>
+            </w:r>
+            <w:r>
+              <w:rPr>
+                <w:noProof/>
+              </w:rPr>
+              <w:instrText xml:space="preserve"> PAGEREF _Toc237036020 \h </w:instrText>
+            </w:r>
+            <w:r>
+              <w:rPr>
+                <w:noProof/>
+              </w:rPr>
+            </w:r>
+            <w:r>
+              <w:rPr>
+                <w:noProof/>
+              </w:rPr>
+              <w:fldChar w:fldCharType="separate"/>
+            </w:r>
+            <w:r>
+              <w:rPr>
+                <w:noProof/>
+              </w:rPr>
+              <w:t>11</w:t>
+            </w:r>
+            <w:r>
+              <w:rPr>
+                <w:noProof/>
+              </w:rPr>
+              <w:fldChar w:fldCharType="end"/>
+            </w:r>
+          </w:hyperlink>
+        </w:p>
+        <w:p>
+          <w:pPr>
+            <w:pStyle w:val="TM2"/>
+            <w:tabs>
+              <w:tab w:val="right" w:leader="dot" w:pos="9696"/>
+            </w:tabs>
+            <w:rPr>
+              <w:rFonts w:asciiTheme="minorHAnsi" w:eastAsiaTheme="minorEastAsia" w:hAnsiTheme="minorHAnsi" w:cstheme="minorBidi"/>
+              <w:noProof/>
+              <w:kern w:val="2"/>
+              <w:sz w:val="24"/>
+              <w:szCs w:val="24"/>
+              <w14:ligatures w14:val="standardContextual"/>
+            </w:rPr>
+          </w:pPr>
+          <w:hyperlink w:anchor="_Toc237036021" w:history="1">
+            <w:r>
+              <w:rPr>
+                <w:rStyle w:val="Lienhypertexte"/>
+                <w:b/>
+                <w:bCs/>
+                <w:noProof/>
+              </w:rPr>
+              <w:t>7.5 Application Mobile</w:t>
+            </w:r>
+            <w:r>
+              <w:rPr>
+                <w:noProof/>
+              </w:rPr>
+              <w:tab/>
+            </w:r>
+            <w:r>
+              <w:rPr>
+                <w:noProof/>
+              </w:rPr>
+              <w:fldChar w:fldCharType="begin"/>
+            </w:r>
+            <w:r>
+              <w:rPr>
+                <w:noProof/>
+              </w:rPr>
+              <w:instrText xml:space="preserve"> PAGEREF _Toc237036021 \h </w:instrText>
+            </w:r>
+            <w:r>
+              <w:rPr>
+                <w:noProof/>
+              </w:rPr>
+            </w:r>
+            <w:r>
+              <w:rPr>
+                <w:noProof/>
+              </w:rPr>
+              <w:fldChar w:fldCharType="separate"/>
+            </w:r>
+            <w:r>
+              <w:rPr>
+                <w:noProof/>
+              </w:rPr>
+              <w:t>11</w:t>
             </w:r>
             <w:r>
               <w:rPr>
@@ -1378,10 +1823,15 @@
               <w:tab w:val="right" w:leader="dot" w:pos="9696"/>
             </w:tabs>
             <w:rPr>
+              <w:rFonts w:asciiTheme="minorHAnsi" w:eastAsiaTheme="minorEastAsia" w:hAnsiTheme="minorHAnsi" w:cstheme="minorBidi"/>
               <w:noProof/>
+              <w:kern w:val="2"/>
+              <w:sz w:val="24"/>
+              <w:szCs w:val="24"/>
+              <w14:ligatures w14:val="standardContextual"/>
             </w:rPr>
           </w:pPr>
-          <w:hyperlink w:anchor="_Toc236664401" w:history="1">
+          <w:hyperlink w:anchor="_Toc237036022" w:history="1">
             <w:r>
               <w:rPr>
                 <w:rStyle w:val="Lienhypertexte"/>
@@ -1389,7 +1839,7 @@
                 <w:bCs/>
                 <w:noProof/>
               </w:rPr>
-              <w:t>7. Livrables attendus</w:t>
+              <w:t>8. Planification du projet</w:t>
             </w:r>
             <w:r>
               <w:rPr>
@@ -1407,7 +1857,7 @@
               <w:rPr>
                 <w:noProof/>
               </w:rPr>
-              <w:instrText xml:space="preserve"> PAGEREF _Toc236664401 \h </w:instrText>
+              <w:instrText xml:space="preserve"> PAGEREF _Toc237036022 \h </w:instrText>
             </w:r>
             <w:r>
               <w:rPr>
@@ -1424,385 +1874,7 @@
               <w:rPr>
                 <w:noProof/>
               </w:rPr>
-              <w:t>10</w:t>
-            </w:r>
-            <w:r>
-              <w:rPr>
-                <w:noProof/>
-              </w:rPr>
-              <w:fldChar w:fldCharType="end"/>
-            </w:r>
-          </w:hyperlink>
-        </w:p>
-        <w:p>
-          <w:pPr>
-            <w:pStyle w:val="TM2"/>
-            <w:tabs>
-              <w:tab w:val="right" w:leader="dot" w:pos="9696"/>
-            </w:tabs>
-            <w:rPr>
-              <w:noProof/>
-            </w:rPr>
-          </w:pPr>
-          <w:hyperlink w:anchor="_Toc236664402" w:history="1">
-            <w:r>
-              <w:rPr>
-                <w:rStyle w:val="Lienhypertexte"/>
-                <w:b/>
-                <w:bCs/>
-                <w:noProof/>
-              </w:rPr>
-              <w:t>7.1 Conception &amp; maquette</w:t>
-            </w:r>
-            <w:r>
-              <w:rPr>
-                <w:noProof/>
-              </w:rPr>
-              <w:tab/>
-            </w:r>
-            <w:r>
-              <w:rPr>
-                <w:noProof/>
-              </w:rPr>
-              <w:fldChar w:fldCharType="begin"/>
-            </w:r>
-            <w:r>
-              <w:rPr>
-                <w:noProof/>
-              </w:rPr>
-              <w:instrText xml:space="preserve"> PAGEREF _Toc236664402 \h </w:instrText>
-            </w:r>
-            <w:r>
-              <w:rPr>
-                <w:noProof/>
-              </w:rPr>
-            </w:r>
-            <w:r>
-              <w:rPr>
-                <w:noProof/>
-              </w:rPr>
-              <w:fldChar w:fldCharType="separate"/>
-            </w:r>
-            <w:r>
-              <w:rPr>
-                <w:noProof/>
-              </w:rPr>
-              <w:t>10</w:t>
-            </w:r>
-            <w:r>
-              <w:rPr>
-                <w:noProof/>
-              </w:rPr>
-              <w:fldChar w:fldCharType="end"/>
-            </w:r>
-          </w:hyperlink>
-        </w:p>
-        <w:p>
-          <w:pPr>
-            <w:pStyle w:val="TM2"/>
-            <w:tabs>
-              <w:tab w:val="right" w:leader="dot" w:pos="9696"/>
-            </w:tabs>
-            <w:rPr>
-              <w:noProof/>
-            </w:rPr>
-          </w:pPr>
-          <w:hyperlink w:anchor="_Toc236664403" w:history="1">
-            <w:r>
-              <w:rPr>
-                <w:rStyle w:val="Lienhypertexte"/>
-                <w:b/>
-                <w:bCs/>
-                <w:noProof/>
-              </w:rPr>
-              <w:t>7.2 Backend</w:t>
-            </w:r>
-            <w:r>
-              <w:rPr>
-                <w:noProof/>
-              </w:rPr>
-              <w:tab/>
-            </w:r>
-            <w:r>
-              <w:rPr>
-                <w:noProof/>
-              </w:rPr>
-              <w:fldChar w:fldCharType="begin"/>
-            </w:r>
-            <w:r>
-              <w:rPr>
-                <w:noProof/>
-              </w:rPr>
-              <w:instrText xml:space="preserve"> PAGEREF _Toc236664403 \h </w:instrText>
-            </w:r>
-            <w:r>
-              <w:rPr>
-                <w:noProof/>
-              </w:rPr>
-            </w:r>
-            <w:r>
-              <w:rPr>
-                <w:noProof/>
-              </w:rPr>
-              <w:fldChar w:fldCharType="separate"/>
-            </w:r>
-            <w:r>
-              <w:rPr>
-                <w:noProof/>
-              </w:rPr>
-              <w:t>10</w:t>
-            </w:r>
-            <w:r>
-              <w:rPr>
-                <w:noProof/>
-              </w:rPr>
-              <w:fldChar w:fldCharType="end"/>
-            </w:r>
-          </w:hyperlink>
-        </w:p>
-        <w:p>
-          <w:pPr>
-            <w:pStyle w:val="TM2"/>
-            <w:tabs>
-              <w:tab w:val="right" w:leader="dot" w:pos="9696"/>
-            </w:tabs>
-            <w:rPr>
-              <w:noProof/>
-            </w:rPr>
-          </w:pPr>
-          <w:hyperlink w:anchor="_Toc236664404" w:history="1">
-            <w:r>
-              <w:rPr>
-                <w:rStyle w:val="Lienhypertexte"/>
-                <w:b/>
-                <w:bCs/>
-                <w:noProof/>
-              </w:rPr>
-              <w:t>7.3 Modèle IA</w:t>
-            </w:r>
-            <w:r>
-              <w:rPr>
-                <w:noProof/>
-              </w:rPr>
-              <w:tab/>
-            </w:r>
-            <w:r>
-              <w:rPr>
-                <w:noProof/>
-              </w:rPr>
-              <w:fldChar w:fldCharType="begin"/>
-            </w:r>
-            <w:r>
-              <w:rPr>
-                <w:noProof/>
-              </w:rPr>
-              <w:instrText xml:space="preserve"> PAGEREF _Toc236664404 \h </w:instrText>
-            </w:r>
-            <w:r>
-              <w:rPr>
-                <w:noProof/>
-              </w:rPr>
-            </w:r>
-            <w:r>
-              <w:rPr>
-                <w:noProof/>
-              </w:rPr>
-              <w:fldChar w:fldCharType="separate"/>
-            </w:r>
-            <w:r>
-              <w:rPr>
-                <w:noProof/>
-              </w:rPr>
-              <w:t>10</w:t>
-            </w:r>
-            <w:r>
-              <w:rPr>
-                <w:noProof/>
-              </w:rPr>
-              <w:fldChar w:fldCharType="end"/>
-            </w:r>
-          </w:hyperlink>
-        </w:p>
-        <w:p>
-          <w:pPr>
-            <w:pStyle w:val="TM2"/>
-            <w:tabs>
-              <w:tab w:val="right" w:leader="dot" w:pos="9696"/>
-            </w:tabs>
-            <w:rPr>
-              <w:noProof/>
-            </w:rPr>
-          </w:pPr>
-          <w:hyperlink w:anchor="_Toc236664405" w:history="1">
-            <w:r>
-              <w:rPr>
-                <w:rStyle w:val="Lienhypertexte"/>
-                <w:b/>
-                <w:bCs/>
-                <w:noProof/>
-              </w:rPr>
-              <w:t>7.4 Application Web</w:t>
-            </w:r>
-            <w:r>
-              <w:rPr>
-                <w:noProof/>
-              </w:rPr>
-              <w:tab/>
-            </w:r>
-            <w:r>
-              <w:rPr>
-                <w:noProof/>
-              </w:rPr>
-              <w:fldChar w:fldCharType="begin"/>
-            </w:r>
-            <w:r>
-              <w:rPr>
-                <w:noProof/>
-              </w:rPr>
-              <w:instrText xml:space="preserve"> PAGEREF _Toc236664405 \h </w:instrText>
-            </w:r>
-            <w:r>
-              <w:rPr>
-                <w:noProof/>
-              </w:rPr>
-            </w:r>
-            <w:r>
-              <w:rPr>
-                <w:noProof/>
-              </w:rPr>
-              <w:fldChar w:fldCharType="separate"/>
-            </w:r>
-            <w:r>
-              <w:rPr>
-                <w:noProof/>
-              </w:rPr>
-              <w:t>10</w:t>
-            </w:r>
-            <w:r>
-              <w:rPr>
-                <w:noProof/>
-              </w:rPr>
-              <w:fldChar w:fldCharType="end"/>
-            </w:r>
-          </w:hyperlink>
-        </w:p>
-        <w:p>
-          <w:pPr>
-            <w:pStyle w:val="TM2"/>
-            <w:tabs>
-              <w:tab w:val="right" w:leader="dot" w:pos="9696"/>
-            </w:tabs>
-            <w:rPr>
-              <w:noProof/>
-            </w:rPr>
-          </w:pPr>
-          <w:hyperlink w:anchor="_Toc236664406" w:history="1">
-            <w:r>
-              <w:rPr>
-                <w:rStyle w:val="Lienhypertexte"/>
-                <w:b/>
-                <w:bCs/>
-                <w:noProof/>
-              </w:rPr>
-              <w:t>7.5 Application Mobile</w:t>
-            </w:r>
-            <w:r>
-              <w:rPr>
-                <w:noProof/>
-              </w:rPr>
-              <w:tab/>
-            </w:r>
-            <w:r>
-              <w:rPr>
-                <w:noProof/>
-              </w:rPr>
-              <w:fldChar w:fldCharType="begin"/>
-            </w:r>
-            <w:r>
-              <w:rPr>
-                <w:noProof/>
-              </w:rPr>
-              <w:instrText xml:space="preserve"> PAGEREF _Toc236664406 \h </w:instrText>
-            </w:r>
-            <w:r>
-              <w:rPr>
-                <w:noProof/>
-              </w:rPr>
-            </w:r>
-            <w:r>
-              <w:rPr>
-                <w:noProof/>
-              </w:rPr>
-              <w:fldChar w:fldCharType="separate"/>
-            </w:r>
-            <w:r>
-              <w:rPr>
-                <w:noProof/>
-              </w:rPr>
-              <w:t>10</w:t>
-            </w:r>
-            <w:r>
-              <w:rPr>
-                <w:noProof/>
-              </w:rPr>
-              <w:fldChar w:fldCharType="end"/>
-            </w:r>
-          </w:hyperlink>
-        </w:p>
-        <w:p>
-          <w:pPr>
-            <w:pStyle w:val="TM1"/>
-            <w:tabs>
-              <w:tab w:val="right" w:leader="dot" w:pos="9696"/>
-            </w:tabs>
-            <w:rPr>
-              <w:noProof/>
-            </w:rPr>
-          </w:pPr>
-          <w:hyperlink w:anchor="_Toc236664407" w:history="1">
-            <w:r>
-              <w:rPr>
-                <w:rStyle w:val="Lienhypertexte"/>
-                <w:b/>
-                <w:bCs/>
-                <w:noProof/>
-              </w:rPr>
-              <w:t>8. Planification du projet</w:t>
-            </w:r>
-            <w:r>
-              <w:rPr>
-                <w:noProof/>
-              </w:rPr>
-              <w:tab/>
-            </w:r>
-            <w:r>
-              <w:rPr>
-                <w:noProof/>
-              </w:rPr>
-              <w:fldChar w:fldCharType="begin"/>
-            </w:r>
-            <w:r>
-              <w:rPr>
-                <w:noProof/>
-              </w:rPr>
-              <w:instrText xml:space="preserve"> PAGEREF _Toc236664407 \h </w:instrText>
-            </w:r>
-            <w:r>
-              <w:rPr>
-                <w:noProof/>
-              </w:rPr>
-            </w:r>
-            <w:r>
-              <w:rPr>
-                <w:noProof/>
-              </w:rPr>
-              <w:fldChar w:fldCharType="separate"/>
-            </w:r>
-            <w:r>
-              <w:rPr>
-                <w:noProof/>
-              </w:rPr>
-              <w:t>12</w:t>
+              <w:t>13</w:t>
             </w:r>
             <w:r>
               <w:rPr>
@@ -1832,7 +1904,7 @@
         </w:pBdr>
         <w:spacing w:before="400" w:after="200"/>
       </w:pPr>
-      <w:bookmarkStart w:id="1" w:name="_Toc236664384"/>
+      <w:bookmarkStart w:id="1" w:name="_Toc237036000"/>
       <w:r>
         <w:rPr>
           <w:b/>
@@ -1878,12 +1950,6 @@
         <w:gridCol w:w="4200"/>
       </w:tblGrid>
       <w:tr>
-        <w:tblPrEx>
-          <w:tblCellMar>
-            <w:top w:w="0" w:type="dxa"/>
-            <w:bottom w:w="0" w:type="dxa"/>
-          </w:tblCellMar>
-        </w:tblPrEx>
         <w:trPr>
           <w:tblHeader/>
         </w:trPr>
@@ -1964,12 +2030,6 @@
         </w:tc>
       </w:tr>
       <w:tr>
-        <w:tblPrEx>
-          <w:tblCellMar>
-            <w:top w:w="0" w:type="dxa"/>
-            <w:bottom w:w="0" w:type="dxa"/>
-          </w:tblCellMar>
-        </w:tblPrEx>
         <w:tc>
           <w:tcPr>
             <w:tcW w:w="2600" w:type="dxa"/>
@@ -2043,12 +2103,6 @@
         </w:tc>
       </w:tr>
       <w:tr>
-        <w:tblPrEx>
-          <w:tblCellMar>
-            <w:top w:w="0" w:type="dxa"/>
-            <w:bottom w:w="0" w:type="dxa"/>
-          </w:tblCellMar>
-        </w:tblPrEx>
         <w:tc>
           <w:tcPr>
             <w:tcW w:w="2600" w:type="dxa"/>
@@ -2095,6 +2149,14 @@
               </w:rPr>
               <w:t>Chef d'équipe &amp; Développeur Mobile</w:t>
             </w:r>
+            <w:r>
+              <w:rPr>
+                <w:color w:val="1F1F1F"/>
+                <w:sz w:val="19"/>
+                <w:szCs w:val="19"/>
+              </w:rPr>
+              <w:t xml:space="preserve"> &amp; Développeur Web &amp; Data AI &amp; Gestion projet</w:t>
+            </w:r>
           </w:p>
         </w:tc>
         <w:tc>
@@ -2122,12 +2184,6 @@
         </w:tc>
       </w:tr>
       <w:tr>
-        <w:tblPrEx>
-          <w:tblCellMar>
-            <w:top w:w="0" w:type="dxa"/>
-            <w:bottom w:w="0" w:type="dxa"/>
-          </w:tblCellMar>
-        </w:tblPrEx>
         <w:tc>
           <w:tcPr>
             <w:tcW w:w="2600" w:type="dxa"/>
@@ -2201,12 +2257,6 @@
         </w:tc>
       </w:tr>
       <w:tr>
-        <w:tblPrEx>
-          <w:tblCellMar>
-            <w:top w:w="0" w:type="dxa"/>
-            <w:bottom w:w="0" w:type="dxa"/>
-          </w:tblCellMar>
-        </w:tblPrEx>
         <w:tc>
           <w:tcPr>
             <w:tcW w:w="2600" w:type="dxa"/>
@@ -2280,12 +2330,6 @@
         </w:tc>
       </w:tr>
       <w:tr>
-        <w:tblPrEx>
-          <w:tblCellMar>
-            <w:top w:w="0" w:type="dxa"/>
-            <w:bottom w:w="0" w:type="dxa"/>
-          </w:tblCellMar>
-        </w:tblPrEx>
         <w:tc>
           <w:tcPr>
             <w:tcW w:w="2600" w:type="dxa"/>
@@ -2338,6 +2382,22 @@
               </w:rPr>
               <w:t>Data &amp; IA</w:t>
             </w:r>
+            <w:r>
+              <w:rPr>
+                <w:color w:val="1F1F1F"/>
+                <w:sz w:val="19"/>
+                <w:szCs w:val="19"/>
+              </w:rPr>
+              <w:t xml:space="preserve"> &amp; Marketing</w:t>
+            </w:r>
+            <w:r>
+              <w:rPr>
+                <w:color w:val="1F1F1F"/>
+                <w:sz w:val="19"/>
+                <w:szCs w:val="19"/>
+              </w:rPr>
+              <w:t xml:space="preserve"> Management</w:t>
+            </w:r>
           </w:p>
         </w:tc>
         <w:tc>
@@ -2383,12 +2443,6 @@
         </w:tc>
       </w:tr>
       <w:tr>
-        <w:tblPrEx>
-          <w:tblCellMar>
-            <w:top w:w="0" w:type="dxa"/>
-            <w:bottom w:w="0" w:type="dxa"/>
-          </w:tblCellMar>
-        </w:tblPrEx>
         <w:tc>
           <w:tcPr>
             <w:tcW w:w="2600" w:type="dxa"/>
@@ -2513,7 +2567,7 @@
         </w:pBdr>
         <w:spacing w:before="400" w:after="200"/>
       </w:pPr>
-      <w:bookmarkStart w:id="2" w:name="_Toc236664385"/>
+      <w:bookmarkStart w:id="2" w:name="_Toc237036001"/>
       <w:r>
         <w:rPr>
           <w:b/>
@@ -2530,7 +2584,7 @@
         <w:pStyle w:val="Titre2"/>
         <w:spacing w:before="300" w:after="150"/>
       </w:pPr>
-      <w:bookmarkStart w:id="3" w:name="_Toc236664386"/>
+      <w:bookmarkStart w:id="3" w:name="_Toc237036002"/>
       <w:r>
         <w:rPr>
           <w:b/>
@@ -2549,7 +2603,43 @@
         <w:rPr>
           <w:color w:val="1F1F1F"/>
         </w:rPr>
-        <w:t>Le projet KWISMO est développé en partenariat avec Orange Cameroun et bénéficie du soutien de l'Orange Digital Center.</w:t>
+        <w:t>Le projet KWISMO est développé en partenariat avec Orange</w:t>
+      </w:r>
+      <w:r>
+        <w:rPr>
+          <w:color w:val="1F1F1F"/>
+        </w:rPr>
+        <w:t xml:space="preserve"> Digital </w:t>
+      </w:r>
+      <w:r>
+        <w:rPr>
+          <w:color w:val="1F1F1F"/>
+        </w:rPr>
+        <w:t>C</w:t>
+      </w:r>
+      <w:r>
+        <w:rPr>
+          <w:color w:val="1F1F1F"/>
+        </w:rPr>
+        <w:t>enter</w:t>
+      </w:r>
+      <w:r>
+        <w:rPr>
+          <w:color w:val="1F1F1F"/>
+        </w:rPr>
+        <w:t xml:space="preserve"> et bénéficie d</w:t>
+      </w:r>
+      <w:r>
+        <w:rPr>
+          <w:color w:val="1F1F1F"/>
+        </w:rPr>
+        <w:t>e son</w:t>
+      </w:r>
+      <w:r>
+        <w:rPr>
+          <w:color w:val="1F1F1F"/>
+        </w:rPr>
+        <w:t xml:space="preserve"> soutien.</w:t>
       </w:r>
     </w:p>
     <w:p>
@@ -2557,7 +2647,7 @@
         <w:pStyle w:val="Titre2"/>
         <w:spacing w:before="300" w:after="150"/>
       </w:pPr>
-      <w:bookmarkStart w:id="4" w:name="_Toc236664387"/>
+      <w:bookmarkStart w:id="4" w:name="_Toc237036003"/>
       <w:r>
         <w:rPr>
           <w:b/>
@@ -2584,7 +2674,7 @@
         <w:pStyle w:val="Titre2"/>
         <w:spacing w:before="300" w:after="150"/>
       </w:pPr>
-      <w:bookmarkStart w:id="5" w:name="_Toc236664388"/>
+      <w:bookmarkStart w:id="5" w:name="_Toc237036004"/>
       <w:r>
         <w:rPr>
           <w:b/>
@@ -2633,7 +2723,7 @@
         </w:pBdr>
         <w:spacing w:before="400" w:after="200"/>
       </w:pPr>
-      <w:bookmarkStart w:id="6" w:name="_Toc236664389"/>
+      <w:bookmarkStart w:id="6" w:name="_Toc237036005"/>
       <w:r>
         <w:rPr>
           <w:b/>
@@ -2650,7 +2740,7 @@
         <w:pStyle w:val="Titre2"/>
         <w:spacing w:before="300" w:after="150"/>
       </w:pPr>
-      <w:bookmarkStart w:id="7" w:name="_Toc236664390"/>
+      <w:bookmarkStart w:id="7" w:name="_Toc237036006"/>
       <w:r>
         <w:rPr>
           <w:b/>
@@ -2688,12 +2778,6 @@
         <w:gridCol w:w="2425"/>
       </w:tblGrid>
       <w:tr>
-        <w:tblPrEx>
-          <w:tblCellMar>
-            <w:top w:w="0" w:type="dxa"/>
-            <w:bottom w:w="0" w:type="dxa"/>
-          </w:tblCellMar>
-        </w:tblPrEx>
         <w:tc>
           <w:tcPr>
             <w:tcW w:w="1250" w:type="pct"/>
@@ -2944,7 +3028,7 @@
         <w:pStyle w:val="Titre2"/>
         <w:spacing w:before="300" w:after="150"/>
       </w:pPr>
-      <w:bookmarkStart w:id="8" w:name="_Toc236664391"/>
+      <w:bookmarkStart w:id="8" w:name="_Toc237036007"/>
       <w:r>
         <w:rPr>
           <w:b/>
@@ -2981,12 +3065,6 @@
         <w:gridCol w:w="3234"/>
       </w:tblGrid>
       <w:tr>
-        <w:tblPrEx>
-          <w:tblCellMar>
-            <w:top w:w="0" w:type="dxa"/>
-            <w:bottom w:w="0" w:type="dxa"/>
-          </w:tblCellMar>
-        </w:tblPrEx>
         <w:tc>
           <w:tcPr>
             <w:tcW w:w="1250" w:type="pct"/>
@@ -3198,12 +3276,6 @@
         <w:gridCol w:w="2700"/>
       </w:tblGrid>
       <w:tr>
-        <w:tblPrEx>
-          <w:tblCellMar>
-            <w:top w:w="0" w:type="dxa"/>
-            <w:bottom w:w="0" w:type="dxa"/>
-          </w:tblCellMar>
-        </w:tblPrEx>
         <w:trPr>
           <w:tblHeader/>
         </w:trPr>
@@ -3259,12 +3331,6 @@
         </w:tc>
       </w:tr>
       <w:tr>
-        <w:tblPrEx>
-          <w:tblCellMar>
-            <w:top w:w="0" w:type="dxa"/>
-            <w:bottom w:w="0" w:type="dxa"/>
-          </w:tblCellMar>
-        </w:tblPrEx>
         <w:tc>
           <w:tcPr>
             <w:tcW w:w="7000" w:type="dxa"/>
@@ -3318,12 +3384,6 @@
         </w:tc>
       </w:tr>
       <w:tr>
-        <w:tblPrEx>
-          <w:tblCellMar>
-            <w:top w:w="0" w:type="dxa"/>
-            <w:bottom w:w="0" w:type="dxa"/>
-          </w:tblCellMar>
-        </w:tblPrEx>
         <w:tc>
           <w:tcPr>
             <w:tcW w:w="7000" w:type="dxa"/>
@@ -3377,12 +3437,6 @@
         </w:tc>
       </w:tr>
       <w:tr>
-        <w:tblPrEx>
-          <w:tblCellMar>
-            <w:top w:w="0" w:type="dxa"/>
-            <w:bottom w:w="0" w:type="dxa"/>
-          </w:tblCellMar>
-        </w:tblPrEx>
         <w:tc>
           <w:tcPr>
             <w:tcW w:w="7000" w:type="dxa"/>
@@ -3483,7 +3537,7 @@
         <w:pStyle w:val="Titre2"/>
         <w:spacing w:before="300" w:after="150"/>
       </w:pPr>
-      <w:bookmarkStart w:id="9" w:name="_Toc236664392"/>
+      <w:bookmarkStart w:id="9" w:name="_Toc237036008"/>
       <w:r>
         <w:rPr>
           <w:b/>
@@ -3527,12 +3581,6 @@
         <w:gridCol w:w="4850"/>
       </w:tblGrid>
       <w:tr>
-        <w:tblPrEx>
-          <w:tblCellMar>
-            <w:top w:w="0" w:type="dxa"/>
-            <w:bottom w:w="0" w:type="dxa"/>
-          </w:tblCellMar>
-        </w:tblPrEx>
         <w:trPr>
           <w:tblHeader/>
         </w:trPr>
@@ -3589,12 +3637,6 @@
         </w:tc>
       </w:tr>
       <w:tr>
-        <w:tblPrEx>
-          <w:tblCellMar>
-            <w:top w:w="0" w:type="dxa"/>
-            <w:bottom w:w="0" w:type="dxa"/>
-          </w:tblCellMar>
-        </w:tblPrEx>
         <w:tc>
           <w:tcPr>
             <w:tcW w:w="4850" w:type="dxa"/>
@@ -3645,12 +3687,6 @@
         </w:tc>
       </w:tr>
       <w:tr>
-        <w:tblPrEx>
-          <w:tblCellMar>
-            <w:top w:w="0" w:type="dxa"/>
-            <w:bottom w:w="0" w:type="dxa"/>
-          </w:tblCellMar>
-        </w:tblPrEx>
         <w:tc>
           <w:tcPr>
             <w:tcW w:w="4850" w:type="dxa"/>
@@ -3701,12 +3737,6 @@
         </w:tc>
       </w:tr>
       <w:tr>
-        <w:tblPrEx>
-          <w:tblCellMar>
-            <w:top w:w="0" w:type="dxa"/>
-            <w:bottom w:w="0" w:type="dxa"/>
-          </w:tblCellMar>
-        </w:tblPrEx>
         <w:tc>
           <w:tcPr>
             <w:tcW w:w="4850" w:type="dxa"/>
@@ -3757,12 +3787,6 @@
         </w:tc>
       </w:tr>
       <w:tr>
-        <w:tblPrEx>
-          <w:tblCellMar>
-            <w:top w:w="0" w:type="dxa"/>
-            <w:bottom w:w="0" w:type="dxa"/>
-          </w:tblCellMar>
-        </w:tblPrEx>
         <w:tc>
           <w:tcPr>
             <w:tcW w:w="4850" w:type="dxa"/>
@@ -3826,7 +3850,7 @@
         </w:pBdr>
         <w:spacing w:before="400" w:after="200"/>
       </w:pPr>
-      <w:bookmarkStart w:id="10" w:name="_Toc236664393"/>
+      <w:bookmarkStart w:id="10" w:name="_Toc237036009"/>
       <w:r>
         <w:rPr>
           <w:b/>
@@ -3891,15 +3915,9 @@
         <w:tblLook w:val="04A0" w:firstRow="1" w:lastRow="0" w:firstColumn="1" w:lastColumn="0" w:noHBand="0" w:noVBand="1"/>
       </w:tblPr>
       <w:tblGrid>
-        <w:gridCol w:w="9700"/>
+        <w:gridCol w:w="10160"/>
       </w:tblGrid>
       <w:tr>
-        <w:tblPrEx>
-          <w:tblCellMar>
-            <w:top w:w="0" w:type="dxa"/>
-            <w:bottom w:w="0" w:type="dxa"/>
-          </w:tblCellMar>
-        </w:tblPrEx>
         <w:tc>
           <w:tcPr>
             <w:tcW w:w="9700" w:type="dxa"/>
@@ -3919,193 +3937,61 @@
           </w:tcPr>
           <w:p>
             <w:pPr>
-              <w:spacing w:after="80"/>
-            </w:pPr>
-            <w:r>
-              <w:rPr>
-                <w:b/>
-                <w:bCs/>
-                <w:color w:val="F6A020"/>
-                <w:sz w:val="24"/>
-                <w:szCs w:val="24"/>
-              </w:rPr>
-              <w:t xml:space="preserve">Ndongo </w:t>
-            </w:r>
-            <w:proofErr w:type="gramStart"/>
-            <w:r>
-              <w:rPr>
-                <w:b/>
-                <w:bCs/>
-                <w:color w:val="F6A020"/>
-                <w:sz w:val="24"/>
-                <w:szCs w:val="24"/>
-              </w:rPr>
-              <w:t>Marie</w:t>
-            </w:r>
-            <w:r>
-              <w:rPr>
-                <w:color w:val="595959"/>
-                <w:sz w:val="19"/>
-                <w:szCs w:val="19"/>
-              </w:rPr>
-              <w:t xml:space="preserve">  •</w:t>
-            </w:r>
-            <w:proofErr w:type="gramEnd"/>
-            <w:r>
-              <w:rPr>
-                <w:color w:val="595959"/>
-                <w:sz w:val="19"/>
-                <w:szCs w:val="19"/>
-              </w:rPr>
-              <w:t xml:space="preserve">  52 </w:t>
-            </w:r>
-            <w:proofErr w:type="gramStart"/>
-            <w:r>
-              <w:rPr>
-                <w:color w:val="595959"/>
-                <w:sz w:val="19"/>
-                <w:szCs w:val="19"/>
-              </w:rPr>
-              <w:t>ans  •</w:t>
-            </w:r>
-            <w:proofErr w:type="gramEnd"/>
-            <w:r>
-              <w:rPr>
-                <w:color w:val="595959"/>
-                <w:sz w:val="19"/>
-                <w:szCs w:val="19"/>
-              </w:rPr>
-              <w:t xml:space="preserve">  Commerçante au marché central</w:t>
-            </w:r>
-          </w:p>
-          <w:p>
-            <w:pPr>
-              <w:spacing w:after="100"/>
-            </w:pPr>
-            <w:r>
-              <w:rPr>
-                <w:b/>
-                <w:bCs/>
-                <w:color w:val="1F1F1F"/>
-                <w:sz w:val="19"/>
-                <w:szCs w:val="19"/>
-              </w:rPr>
-              <w:t>Situation vécue</w:t>
-            </w:r>
-          </w:p>
-          <w:p>
-            <w:pPr>
-              <w:spacing w:after="120" w:line="264" w:lineRule="auto"/>
-            </w:pPr>
-            <w:r>
-              <w:rPr>
-                <w:color w:val="1F1F1F"/>
-                <w:sz w:val="20"/>
-                <w:szCs w:val="20"/>
-              </w:rPr>
-              <w:t>Marie reçoit un appel d'un numéro se présentant comme le service client de son opérateur Mobile Money, l'informant d'un « problème de sécurité » sur son compte. L'interlocuteur, très convaincant, lui demande de composer un code USSD pour « vérifier son solde ». Ce code autorise en réalité un transfert vers un compte tiers.</w:t>
-            </w:r>
-          </w:p>
-          <w:p>
-            <w:pPr>
-              <w:spacing w:after="80"/>
-            </w:pPr>
-            <w:r>
-              <w:rPr>
-                <w:b/>
-                <w:bCs/>
-                <w:color w:val="1F1F1F"/>
-                <w:sz w:val="19"/>
-                <w:szCs w:val="19"/>
-              </w:rPr>
-              <w:t>Points de friction</w:t>
-            </w:r>
-          </w:p>
-          <w:p>
-            <w:pPr>
-              <w:pStyle w:val="Paragraphedeliste"/>
-              <w:numPr>
-                <w:ilvl w:val="0"/>
-                <w:numId w:val="2"/>
-              </w:numPr>
-              <w:spacing w:after="60"/>
-            </w:pPr>
-            <w:r>
-              <w:rPr>
-                <w:color w:val="1F1F1F"/>
-                <w:sz w:val="20"/>
-                <w:szCs w:val="20"/>
-              </w:rPr>
-              <w:t>Elle n'a aucun moyen de savoir si le numéro appelant est fiable avant de décrocher.</w:t>
-            </w:r>
-          </w:p>
-          <w:p>
-            <w:pPr>
-              <w:pStyle w:val="Paragraphedeliste"/>
-              <w:numPr>
-                <w:ilvl w:val="0"/>
-                <w:numId w:val="2"/>
-              </w:numPr>
-              <w:spacing w:after="60"/>
-            </w:pPr>
-            <w:r>
-              <w:rPr>
-                <w:color w:val="1F1F1F"/>
-                <w:sz w:val="20"/>
-                <w:szCs w:val="20"/>
-              </w:rPr>
-              <w:t>Elle fait confiance à la voix rassurante et au vocabulaire technique employé.</w:t>
-            </w:r>
-          </w:p>
-          <w:p>
-            <w:pPr>
-              <w:pStyle w:val="Paragraphedeliste"/>
-              <w:numPr>
-                <w:ilvl w:val="0"/>
-                <w:numId w:val="2"/>
-              </w:numPr>
-              <w:spacing w:after="60"/>
-            </w:pPr>
-            <w:r>
-              <w:rPr>
-                <w:color w:val="1F1F1F"/>
-                <w:sz w:val="20"/>
-                <w:szCs w:val="20"/>
-              </w:rPr>
-              <w:t>Aucune alerte ne se déclenche pendant l'appel, seulement une perte constatée après coup.</w:t>
-            </w:r>
-          </w:p>
-          <w:p>
-            <w:pPr>
               <w:spacing w:before="100" w:after="40"/>
             </w:pPr>
-            <w:proofErr w:type="gramStart"/>
-            <w:r>
-              <w:rPr>
-                <w:b/>
-                <w:bCs/>
-                <w:color w:val="F6A020"/>
-                <w:sz w:val="19"/>
-                <w:szCs w:val="19"/>
-              </w:rPr>
-              <w:t>Besoin</w:t>
-            </w:r>
-            <w:r>
-              <w:rPr>
-                <w:color w:val="1F1F1F"/>
-                <w:sz w:val="20"/>
-                <w:szCs w:val="20"/>
-              </w:rPr>
-              <w:t xml:space="preserve">  Être</w:t>
-            </w:r>
-            <w:proofErr w:type="gramEnd"/>
-            <w:r>
-              <w:rPr>
-                <w:color w:val="1F1F1F"/>
-                <w:sz w:val="20"/>
-                <w:szCs w:val="20"/>
-              </w:rPr>
-              <w:t xml:space="preserve"> alertée en temps réel, pendant l'appel, que le numéro est identifié comme suspect.</w:t>
+            <w:r>
+              <w:rPr>
+                <w:noProof/>
+              </w:rPr>
+              <w:drawing>
+                <wp:inline distT="0" distB="0" distL="0" distR="0" wp14:anchorId="4F692075" wp14:editId="0F0F1873">
+                  <wp:extent cx="6163310" cy="3466465"/>
+                  <wp:effectExtent l="0" t="0" r="8890" b="635"/>
+                  <wp:docPr id="42" name="Image 41">
+                    <a:extLst xmlns:a="http://schemas.openxmlformats.org/drawingml/2006/main">
+                      <a:ext uri="{FF2B5EF4-FFF2-40B4-BE49-F238E27FC236}">
+                        <a16:creationId xmlns:a16="http://schemas.microsoft.com/office/drawing/2014/main" id="{42BD6154-C855-6CAF-BAAC-326CE914E53E}"/>
+                      </a:ext>
+                    </a:extLst>
+                  </wp:docPr>
+                  <wp:cNvGraphicFramePr>
+                    <a:graphicFrameLocks xmlns:a="http://schemas.openxmlformats.org/drawingml/2006/main" noChangeAspect="1"/>
+                  </wp:cNvGraphicFramePr>
+                  <a:graphic xmlns:a="http://schemas.openxmlformats.org/drawingml/2006/main">
+                    <a:graphicData uri="http://schemas.openxmlformats.org/drawingml/2006/picture">
+                      <pic:pic xmlns:pic="http://schemas.openxmlformats.org/drawingml/2006/picture">
+                        <pic:nvPicPr>
+                          <pic:cNvPr id="42" name="Image 41">
+                            <a:extLst>
+                              <a:ext uri="{FF2B5EF4-FFF2-40B4-BE49-F238E27FC236}">
+                                <a16:creationId xmlns:a16="http://schemas.microsoft.com/office/drawing/2014/main" id="{42BD6154-C855-6CAF-BAAC-326CE914E53E}"/>
+                              </a:ext>
+                            </a:extLst>
+                          </pic:cNvPr>
+                          <pic:cNvPicPr>
+                            <a:picLocks noChangeAspect="1"/>
+                          </pic:cNvPicPr>
+                        </pic:nvPicPr>
+                        <pic:blipFill>
+                          <a:blip r:embed="rId8"/>
+                          <a:stretch>
+                            <a:fillRect/>
+                          </a:stretch>
+                        </pic:blipFill>
+                        <pic:spPr>
+                          <a:xfrm>
+                            <a:off x="0" y="0"/>
+                            <a:ext cx="6163310" cy="3466465"/>
+                          </a:xfrm>
+                          <a:prstGeom prst="rect">
+                            <a:avLst/>
+                          </a:prstGeom>
+                        </pic:spPr>
+                      </pic:pic>
+                    </a:graphicData>
+                  </a:graphic>
+                </wp:inline>
+              </w:drawing>
             </w:r>
           </w:p>
         </w:tc>
@@ -4134,15 +4020,9 @@
         <w:tblLook w:val="04A0" w:firstRow="1" w:lastRow="0" w:firstColumn="1" w:lastColumn="0" w:noHBand="0" w:noVBand="1"/>
       </w:tblPr>
       <w:tblGrid>
-        <w:gridCol w:w="9700"/>
+        <w:gridCol w:w="10160"/>
       </w:tblGrid>
       <w:tr>
-        <w:tblPrEx>
-          <w:tblCellMar>
-            <w:top w:w="0" w:type="dxa"/>
-            <w:bottom w:w="0" w:type="dxa"/>
-          </w:tblCellMar>
-        </w:tblPrEx>
         <w:tc>
           <w:tcPr>
             <w:tcW w:w="9700" w:type="dxa"/>
@@ -4162,203 +4042,61 @@
           </w:tcPr>
           <w:p>
             <w:pPr>
-              <w:spacing w:after="80"/>
-            </w:pPr>
-            <w:r>
-              <w:rPr>
-                <w:b/>
-                <w:bCs/>
-                <w:color w:val="4D6AB1"/>
-                <w:sz w:val="24"/>
-                <w:szCs w:val="24"/>
-              </w:rPr>
-              <w:t xml:space="preserve">Fotso </w:t>
-            </w:r>
-            <w:proofErr w:type="gramStart"/>
-            <w:r>
-              <w:rPr>
-                <w:b/>
-                <w:bCs/>
-                <w:color w:val="4D6AB1"/>
-                <w:sz w:val="24"/>
-                <w:szCs w:val="24"/>
-              </w:rPr>
-              <w:t>Junior</w:t>
-            </w:r>
-            <w:r>
-              <w:rPr>
-                <w:color w:val="595959"/>
-                <w:sz w:val="19"/>
-                <w:szCs w:val="19"/>
-              </w:rPr>
-              <w:t xml:space="preserve">  •</w:t>
-            </w:r>
-            <w:proofErr w:type="gramEnd"/>
-            <w:r>
-              <w:rPr>
-                <w:color w:val="595959"/>
-                <w:sz w:val="19"/>
-                <w:szCs w:val="19"/>
-              </w:rPr>
-              <w:t xml:space="preserve">  27 </w:t>
-            </w:r>
-            <w:proofErr w:type="gramStart"/>
-            <w:r>
-              <w:rPr>
-                <w:color w:val="595959"/>
-                <w:sz w:val="19"/>
-                <w:szCs w:val="19"/>
-              </w:rPr>
-              <w:t>ans  •</w:t>
-            </w:r>
-            <w:proofErr w:type="gramEnd"/>
-            <w:r>
-              <w:rPr>
-                <w:color w:val="595959"/>
-                <w:sz w:val="19"/>
-                <w:szCs w:val="19"/>
-              </w:rPr>
-              <w:t xml:space="preserve">  Chauffeur de </w:t>
-            </w:r>
-            <w:proofErr w:type="spellStart"/>
-            <w:r>
-              <w:rPr>
-                <w:color w:val="595959"/>
-                <w:sz w:val="19"/>
-                <w:szCs w:val="19"/>
-              </w:rPr>
-              <w:t>moto-taxi</w:t>
-            </w:r>
-            <w:proofErr w:type="spellEnd"/>
-          </w:p>
-          <w:p>
-            <w:pPr>
-              <w:spacing w:after="100"/>
-            </w:pPr>
-            <w:r>
-              <w:rPr>
-                <w:b/>
-                <w:bCs/>
-                <w:color w:val="1F1F1F"/>
-                <w:sz w:val="19"/>
-                <w:szCs w:val="19"/>
-              </w:rPr>
-              <w:t>Situation vécue</w:t>
-            </w:r>
-          </w:p>
-          <w:p>
-            <w:pPr>
-              <w:spacing w:after="120" w:line="264" w:lineRule="auto"/>
-            </w:pPr>
-            <w:r>
-              <w:rPr>
-                <w:color w:val="1F1F1F"/>
-                <w:sz w:val="20"/>
-                <w:szCs w:val="20"/>
-              </w:rPr>
-              <w:t>Junior reçoit un SMS puis un appel d'un « agent partenaire » lui proposant de doubler son solde Mobile Money via une offre promotionnelle limitée dans le temps. Pressé par l'urgence annoncée, il transmet son code OTP reçu par SMS, pensant valider une offre alors qu'il valide un retrait.</w:t>
-            </w:r>
-          </w:p>
-          <w:p>
-            <w:pPr>
-              <w:spacing w:after="80"/>
-            </w:pPr>
-            <w:r>
-              <w:rPr>
-                <w:b/>
-                <w:bCs/>
-                <w:color w:val="1F1F1F"/>
-                <w:sz w:val="19"/>
-                <w:szCs w:val="19"/>
-              </w:rPr>
-              <w:t>Points de friction</w:t>
-            </w:r>
-          </w:p>
-          <w:p>
-            <w:pPr>
-              <w:pStyle w:val="Paragraphedeliste"/>
-              <w:numPr>
-                <w:ilvl w:val="0"/>
-                <w:numId w:val="2"/>
-              </w:numPr>
-              <w:spacing w:after="60"/>
-            </w:pPr>
-            <w:r>
-              <w:rPr>
-                <w:color w:val="1F1F1F"/>
-                <w:sz w:val="20"/>
-                <w:szCs w:val="20"/>
-              </w:rPr>
-              <w:t>L'urgence artificielle de l'offre l'empêche de prendre le temps de vérifier.</w:t>
-            </w:r>
-          </w:p>
-          <w:p>
-            <w:pPr>
-              <w:pStyle w:val="Paragraphedeliste"/>
-              <w:numPr>
-                <w:ilvl w:val="0"/>
-                <w:numId w:val="2"/>
-              </w:numPr>
-              <w:spacing w:after="60"/>
-            </w:pPr>
-            <w:r>
-              <w:rPr>
-                <w:color w:val="1F1F1F"/>
-                <w:sz w:val="20"/>
-                <w:szCs w:val="20"/>
-              </w:rPr>
-              <w:t>Il ne sait pas à qui signaler ce type de numéro pour protéger les autres utilisateurs.</w:t>
-            </w:r>
-          </w:p>
-          <w:p>
-            <w:pPr>
-              <w:pStyle w:val="Paragraphedeliste"/>
-              <w:numPr>
-                <w:ilvl w:val="0"/>
-                <w:numId w:val="2"/>
-              </w:numPr>
-              <w:spacing w:after="60"/>
-            </w:pPr>
-            <w:r>
-              <w:rPr>
-                <w:color w:val="1F1F1F"/>
-                <w:sz w:val="20"/>
-                <w:szCs w:val="20"/>
-              </w:rPr>
-              <w:t>Il découvre l'arnaque uniquement après avoir constaté la disparition des fonds.</w:t>
-            </w:r>
-          </w:p>
-          <w:p>
-            <w:pPr>
               <w:spacing w:before="100" w:after="40"/>
             </w:pPr>
-            <w:proofErr w:type="gramStart"/>
-            <w:r>
-              <w:rPr>
-                <w:b/>
-                <w:bCs/>
-                <w:color w:val="4D6AB1"/>
-                <w:sz w:val="19"/>
-                <w:szCs w:val="19"/>
-              </w:rPr>
-              <w:t>Besoin</w:t>
-            </w:r>
-            <w:r>
-              <w:rPr>
-                <w:color w:val="1F1F1F"/>
-                <w:sz w:val="20"/>
-                <w:szCs w:val="20"/>
-              </w:rPr>
-              <w:t xml:space="preserve">  Pouvoir</w:t>
-            </w:r>
-            <w:proofErr w:type="gramEnd"/>
-            <w:r>
-              <w:rPr>
-                <w:color w:val="1F1F1F"/>
-                <w:sz w:val="20"/>
-                <w:szCs w:val="20"/>
-              </w:rPr>
-              <w:t xml:space="preserve"> vérifier la réputation d'un numéro avant d'agir, et signaler facilement le numéro frauduleux à la communauté.</w:t>
+            <w:r>
+              <w:rPr>
+                <w:noProof/>
+              </w:rPr>
+              <w:drawing>
+                <wp:inline distT="0" distB="0" distL="0" distR="0" wp14:anchorId="571B49BB" wp14:editId="4CE862D3">
+                  <wp:extent cx="6163310" cy="3466465"/>
+                  <wp:effectExtent l="0" t="0" r="8890" b="635"/>
+                  <wp:docPr id="5" name="Image 4">
+                    <a:extLst xmlns:a="http://schemas.openxmlformats.org/drawingml/2006/main">
+                      <a:ext uri="{FF2B5EF4-FFF2-40B4-BE49-F238E27FC236}">
+                        <a16:creationId xmlns:a16="http://schemas.microsoft.com/office/drawing/2014/main" id="{A4B872D9-D05C-8F8D-93B8-861A2A6D2CEE}"/>
+                      </a:ext>
+                    </a:extLst>
+                  </wp:docPr>
+                  <wp:cNvGraphicFramePr>
+                    <a:graphicFrameLocks xmlns:a="http://schemas.openxmlformats.org/drawingml/2006/main" noChangeAspect="1"/>
+                  </wp:cNvGraphicFramePr>
+                  <a:graphic xmlns:a="http://schemas.openxmlformats.org/drawingml/2006/main">
+                    <a:graphicData uri="http://schemas.openxmlformats.org/drawingml/2006/picture">
+                      <pic:pic xmlns:pic="http://schemas.openxmlformats.org/drawingml/2006/picture">
+                        <pic:nvPicPr>
+                          <pic:cNvPr id="5" name="Image 4">
+                            <a:extLst>
+                              <a:ext uri="{FF2B5EF4-FFF2-40B4-BE49-F238E27FC236}">
+                                <a16:creationId xmlns:a16="http://schemas.microsoft.com/office/drawing/2014/main" id="{A4B872D9-D05C-8F8D-93B8-861A2A6D2CEE}"/>
+                              </a:ext>
+                            </a:extLst>
+                          </pic:cNvPr>
+                          <pic:cNvPicPr>
+                            <a:picLocks noChangeAspect="1"/>
+                          </pic:cNvPicPr>
+                        </pic:nvPicPr>
+                        <pic:blipFill>
+                          <a:blip r:embed="rId9"/>
+                          <a:stretch>
+                            <a:fillRect/>
+                          </a:stretch>
+                        </pic:blipFill>
+                        <pic:spPr>
+                          <a:xfrm>
+                            <a:off x="0" y="0"/>
+                            <a:ext cx="6163310" cy="3466465"/>
+                          </a:xfrm>
+                          <a:prstGeom prst="rect">
+                            <a:avLst/>
+                          </a:prstGeom>
+                        </pic:spPr>
+                      </pic:pic>
+                    </a:graphicData>
+                  </a:graphic>
+                </wp:inline>
+              </w:drawing>
             </w:r>
           </w:p>
         </w:tc>
@@ -4387,15 +4125,9 @@
         <w:tblLook w:val="04A0" w:firstRow="1" w:lastRow="0" w:firstColumn="1" w:lastColumn="0" w:noHBand="0" w:noVBand="1"/>
       </w:tblPr>
       <w:tblGrid>
-        <w:gridCol w:w="9700"/>
+        <w:gridCol w:w="10160"/>
       </w:tblGrid>
       <w:tr>
-        <w:tblPrEx>
-          <w:tblCellMar>
-            <w:top w:w="0" w:type="dxa"/>
-            <w:bottom w:w="0" w:type="dxa"/>
-          </w:tblCellMar>
-        </w:tblPrEx>
         <w:tc>
           <w:tcPr>
             <w:tcW w:w="9700" w:type="dxa"/>
@@ -4415,193 +4147,62 @@
           </w:tcPr>
           <w:p>
             <w:pPr>
-              <w:spacing w:after="80"/>
-            </w:pPr>
-            <w:r>
-              <w:rPr>
-                <w:b/>
-                <w:bCs/>
-                <w:color w:val="56B039"/>
-                <w:sz w:val="24"/>
-                <w:szCs w:val="24"/>
-              </w:rPr>
-              <w:t xml:space="preserve">Ateba </w:t>
-            </w:r>
-            <w:proofErr w:type="gramStart"/>
-            <w:r>
-              <w:rPr>
-                <w:b/>
-                <w:bCs/>
-                <w:color w:val="56B039"/>
-                <w:sz w:val="24"/>
-                <w:szCs w:val="24"/>
-              </w:rPr>
-              <w:t>Sandrine</w:t>
-            </w:r>
-            <w:r>
-              <w:rPr>
-                <w:color w:val="595959"/>
-                <w:sz w:val="19"/>
-                <w:szCs w:val="19"/>
-              </w:rPr>
-              <w:t xml:space="preserve">  •</w:t>
-            </w:r>
-            <w:proofErr w:type="gramEnd"/>
-            <w:r>
-              <w:rPr>
-                <w:color w:val="595959"/>
-                <w:sz w:val="19"/>
-                <w:szCs w:val="19"/>
-              </w:rPr>
-              <w:t xml:space="preserve">  34 </w:t>
-            </w:r>
-            <w:proofErr w:type="gramStart"/>
-            <w:r>
-              <w:rPr>
-                <w:color w:val="595959"/>
-                <w:sz w:val="19"/>
-                <w:szCs w:val="19"/>
-              </w:rPr>
-              <w:t>ans  •</w:t>
-            </w:r>
-            <w:proofErr w:type="gramEnd"/>
-            <w:r>
-              <w:rPr>
-                <w:color w:val="595959"/>
-                <w:sz w:val="19"/>
-                <w:szCs w:val="19"/>
-              </w:rPr>
-              <w:t xml:space="preserve">  Enseignante, utilisatrice active de WhatsApp</w:t>
-            </w:r>
-          </w:p>
-          <w:p>
-            <w:pPr>
-              <w:spacing w:after="100"/>
-            </w:pPr>
-            <w:r>
-              <w:rPr>
-                <w:b/>
-                <w:bCs/>
-                <w:color w:val="1F1F1F"/>
-                <w:sz w:val="19"/>
-                <w:szCs w:val="19"/>
-              </w:rPr>
-              <w:t>Situation vécue</w:t>
-            </w:r>
-          </w:p>
-          <w:p>
-            <w:pPr>
-              <w:spacing w:after="120" w:line="264" w:lineRule="auto"/>
-            </w:pPr>
-            <w:r>
-              <w:rPr>
-                <w:color w:val="1F1F1F"/>
-                <w:sz w:val="20"/>
-                <w:szCs w:val="20"/>
-              </w:rPr>
-              <w:t>Le compte WhatsApp d'un proche de Sandrine est piraté. Le fraudeur, se faisant passer pour ce proche, lui envoie un message urgent demandant un transfert Mobile Money pour une « urgence médicale ». Le ton et les habitudes de langage imitent suffisamment bien le proche pour semer le doute.</w:t>
-            </w:r>
-          </w:p>
-          <w:p>
-            <w:pPr>
-              <w:spacing w:after="80"/>
-            </w:pPr>
-            <w:r>
-              <w:rPr>
-                <w:b/>
-                <w:bCs/>
-                <w:color w:val="1F1F1F"/>
-                <w:sz w:val="19"/>
-                <w:szCs w:val="19"/>
-              </w:rPr>
-              <w:t>Points de friction</w:t>
-            </w:r>
-          </w:p>
-          <w:p>
-            <w:pPr>
-              <w:pStyle w:val="Paragraphedeliste"/>
-              <w:numPr>
-                <w:ilvl w:val="0"/>
-                <w:numId w:val="2"/>
-              </w:numPr>
-              <w:spacing w:after="60"/>
-            </w:pPr>
-            <w:r>
-              <w:rPr>
-                <w:color w:val="1F1F1F"/>
-                <w:sz w:val="20"/>
-                <w:szCs w:val="20"/>
-              </w:rPr>
-              <w:t>Aucun signal ne l'avertit que le compte WhatsApp du contact a été compromis.</w:t>
-            </w:r>
-          </w:p>
-          <w:p>
-            <w:pPr>
-              <w:pStyle w:val="Paragraphedeliste"/>
-              <w:numPr>
-                <w:ilvl w:val="0"/>
-                <w:numId w:val="2"/>
-              </w:numPr>
-              <w:spacing w:after="60"/>
-            </w:pPr>
-            <w:r>
-              <w:rPr>
-                <w:color w:val="1F1F1F"/>
-                <w:sz w:val="20"/>
-                <w:szCs w:val="20"/>
-              </w:rPr>
-              <w:t>La confiance dans la relation personnelle est exploitée directement.</w:t>
-            </w:r>
-          </w:p>
-          <w:p>
-            <w:pPr>
-              <w:pStyle w:val="Paragraphedeliste"/>
-              <w:numPr>
-                <w:ilvl w:val="0"/>
-                <w:numId w:val="2"/>
-              </w:numPr>
-              <w:spacing w:after="60"/>
-            </w:pPr>
-            <w:r>
-              <w:rPr>
-                <w:color w:val="1F1F1F"/>
-                <w:sz w:val="20"/>
-                <w:szCs w:val="20"/>
-              </w:rPr>
-              <w:t>Elle n'a pas de moyen simple d'alerter ses propres contacts en cas de compromission de son compte.</w:t>
-            </w:r>
-          </w:p>
-          <w:p>
-            <w:pPr>
               <w:spacing w:before="100" w:after="40"/>
             </w:pPr>
-            <w:proofErr w:type="gramStart"/>
-            <w:r>
-              <w:rPr>
-                <w:b/>
-                <w:bCs/>
-                <w:color w:val="56B039"/>
-                <w:sz w:val="19"/>
-                <w:szCs w:val="19"/>
-              </w:rPr>
-              <w:t>Besoin</w:t>
-            </w:r>
-            <w:r>
-              <w:rPr>
-                <w:color w:val="1F1F1F"/>
-                <w:sz w:val="20"/>
-                <w:szCs w:val="20"/>
-              </w:rPr>
-              <w:t xml:space="preserve">  Être</w:t>
-            </w:r>
-            <w:proofErr w:type="gramEnd"/>
-            <w:r>
-              <w:rPr>
-                <w:color w:val="1F1F1F"/>
-                <w:sz w:val="20"/>
-                <w:szCs w:val="20"/>
-              </w:rPr>
-              <w:t xml:space="preserve"> protégée aussi sur WhatsApp, avec un système d'alerte en cas de compte compromis dans son cercle de contacts.</w:t>
+            <w:r>
+              <w:rPr>
+                <w:noProof/>
+              </w:rPr>
+              <w:lastRenderedPageBreak/>
+              <w:drawing>
+                <wp:inline distT="0" distB="0" distL="0" distR="0" wp14:anchorId="69BB16E3" wp14:editId="4969E213">
+                  <wp:extent cx="6163310" cy="3466465"/>
+                  <wp:effectExtent l="0" t="0" r="8890" b="635"/>
+                  <wp:docPr id="1986668041" name="Image 4">
+                    <a:extLst xmlns:a="http://schemas.openxmlformats.org/drawingml/2006/main">
+                      <a:ext uri="{FF2B5EF4-FFF2-40B4-BE49-F238E27FC236}">
+                        <a16:creationId xmlns:a16="http://schemas.microsoft.com/office/drawing/2014/main" id="{76129523-38C5-1DE4-7BB4-B3169FA262D1}"/>
+                      </a:ext>
+                    </a:extLst>
+                  </wp:docPr>
+                  <wp:cNvGraphicFramePr>
+                    <a:graphicFrameLocks xmlns:a="http://schemas.openxmlformats.org/drawingml/2006/main" noChangeAspect="1"/>
+                  </wp:cNvGraphicFramePr>
+                  <a:graphic xmlns:a="http://schemas.openxmlformats.org/drawingml/2006/main">
+                    <a:graphicData uri="http://schemas.openxmlformats.org/drawingml/2006/picture">
+                      <pic:pic xmlns:pic="http://schemas.openxmlformats.org/drawingml/2006/picture">
+                        <pic:nvPicPr>
+                          <pic:cNvPr id="5" name="Image 4">
+                            <a:extLst>
+                              <a:ext uri="{FF2B5EF4-FFF2-40B4-BE49-F238E27FC236}">
+                                <a16:creationId xmlns:a16="http://schemas.microsoft.com/office/drawing/2014/main" id="{76129523-38C5-1DE4-7BB4-B3169FA262D1}"/>
+                              </a:ext>
+                            </a:extLst>
+                          </pic:cNvPr>
+                          <pic:cNvPicPr>
+                            <a:picLocks noChangeAspect="1"/>
+                          </pic:cNvPicPr>
+                        </pic:nvPicPr>
+                        <pic:blipFill>
+                          <a:blip r:embed="rId10"/>
+                          <a:stretch>
+                            <a:fillRect/>
+                          </a:stretch>
+                        </pic:blipFill>
+                        <pic:spPr>
+                          <a:xfrm>
+                            <a:off x="0" y="0"/>
+                            <a:ext cx="6163310" cy="3466465"/>
+                          </a:xfrm>
+                          <a:prstGeom prst="rect">
+                            <a:avLst/>
+                          </a:prstGeom>
+                        </pic:spPr>
+                      </pic:pic>
+                    </a:graphicData>
+                  </a:graphic>
+                </wp:inline>
+              </w:drawing>
             </w:r>
           </w:p>
         </w:tc>
@@ -4620,7 +4221,7 @@
         </w:pBdr>
         <w:spacing w:before="400" w:after="200"/>
       </w:pPr>
-      <w:bookmarkStart w:id="11" w:name="_Toc236664394"/>
+      <w:bookmarkStart w:id="11" w:name="_Toc237036010"/>
       <w:r>
         <w:rPr>
           <w:b/>
@@ -4659,7 +4260,7 @@
         <w:pStyle w:val="Titre2"/>
         <w:spacing w:before="300" w:after="150"/>
       </w:pPr>
-      <w:bookmarkStart w:id="12" w:name="_Toc236664395"/>
+      <w:bookmarkStart w:id="12" w:name="_Toc237036011"/>
       <w:r>
         <w:rPr>
           <w:b/>
@@ -4721,7 +4322,7 @@
         <w:pStyle w:val="Titre2"/>
         <w:spacing w:before="300" w:after="150"/>
       </w:pPr>
-      <w:bookmarkStart w:id="13" w:name="_Toc236664396"/>
+      <w:bookmarkStart w:id="13" w:name="_Toc237036012"/>
       <w:r>
         <w:rPr>
           <w:b/>
@@ -4825,7 +4426,7 @@
         </w:pBdr>
         <w:spacing w:before="400" w:after="200"/>
       </w:pPr>
-      <w:bookmarkStart w:id="14" w:name="_Toc236664397"/>
+      <w:bookmarkStart w:id="14" w:name="_Toc237036013"/>
       <w:r>
         <w:rPr>
           <w:b/>
@@ -4842,7 +4443,7 @@
         <w:pStyle w:val="Titre2"/>
         <w:spacing w:before="300" w:after="150"/>
       </w:pPr>
-      <w:bookmarkStart w:id="15" w:name="_Toc236664398"/>
+      <w:bookmarkStart w:id="15" w:name="_Toc237036014"/>
       <w:r>
         <w:rPr>
           <w:b/>
@@ -4877,12 +4478,6 @@
         <w:gridCol w:w="1800"/>
       </w:tblGrid>
       <w:tr>
-        <w:tblPrEx>
-          <w:tblCellMar>
-            <w:top w:w="0" w:type="dxa"/>
-            <w:bottom w:w="0" w:type="dxa"/>
-          </w:tblCellMar>
-        </w:tblPrEx>
         <w:trPr>
           <w:tblHeader/>
         </w:trPr>
@@ -4992,12 +4587,6 @@
         </w:tc>
       </w:tr>
       <w:tr>
-        <w:tblPrEx>
-          <w:tblCellMar>
-            <w:top w:w="0" w:type="dxa"/>
-            <w:bottom w:w="0" w:type="dxa"/>
-          </w:tblCellMar>
-        </w:tblPrEx>
         <w:tc>
           <w:tcPr>
             <w:tcW w:w="4300" w:type="dxa"/>
@@ -5103,12 +4692,6 @@
         </w:tc>
       </w:tr>
       <w:tr>
-        <w:tblPrEx>
-          <w:tblCellMar>
-            <w:top w:w="0" w:type="dxa"/>
-            <w:bottom w:w="0" w:type="dxa"/>
-          </w:tblCellMar>
-        </w:tblPrEx>
         <w:tc>
           <w:tcPr>
             <w:tcW w:w="4300" w:type="dxa"/>
@@ -5214,12 +4797,6 @@
         </w:tc>
       </w:tr>
       <w:tr>
-        <w:tblPrEx>
-          <w:tblCellMar>
-            <w:top w:w="0" w:type="dxa"/>
-            <w:bottom w:w="0" w:type="dxa"/>
-          </w:tblCellMar>
-        </w:tblPrEx>
         <w:tc>
           <w:tcPr>
             <w:tcW w:w="4300" w:type="dxa"/>
@@ -5325,12 +4902,6 @@
         </w:tc>
       </w:tr>
       <w:tr>
-        <w:tblPrEx>
-          <w:tblCellMar>
-            <w:top w:w="0" w:type="dxa"/>
-            <w:bottom w:w="0" w:type="dxa"/>
-          </w:tblCellMar>
-        </w:tblPrEx>
         <w:tc>
           <w:tcPr>
             <w:tcW w:w="4300" w:type="dxa"/>
@@ -5436,12 +5007,6 @@
         </w:tc>
       </w:tr>
       <w:tr>
-        <w:tblPrEx>
-          <w:tblCellMar>
-            <w:top w:w="0" w:type="dxa"/>
-            <w:bottom w:w="0" w:type="dxa"/>
-          </w:tblCellMar>
-        </w:tblPrEx>
         <w:tc>
           <w:tcPr>
             <w:tcW w:w="4300" w:type="dxa"/>
@@ -5547,12 +5112,6 @@
         </w:tc>
       </w:tr>
       <w:tr>
-        <w:tblPrEx>
-          <w:tblCellMar>
-            <w:top w:w="0" w:type="dxa"/>
-            <w:bottom w:w="0" w:type="dxa"/>
-          </w:tblCellMar>
-        </w:tblPrEx>
         <w:tc>
           <w:tcPr>
             <w:tcW w:w="4300" w:type="dxa"/>
@@ -5663,7 +5222,7 @@
         <w:pStyle w:val="Titre2"/>
         <w:spacing w:before="300" w:after="150"/>
       </w:pPr>
-      <w:bookmarkStart w:id="16" w:name="_Toc236664399"/>
+      <w:bookmarkStart w:id="16" w:name="_Toc237036015"/>
       <w:r>
         <w:rPr>
           <w:b/>
@@ -5708,12 +5267,6 @@
         <w:gridCol w:w="2900"/>
       </w:tblGrid>
       <w:tr>
-        <w:tblPrEx>
-          <w:tblCellMar>
-            <w:top w:w="0" w:type="dxa"/>
-            <w:bottom w:w="0" w:type="dxa"/>
-          </w:tblCellMar>
-        </w:tblPrEx>
         <w:trPr>
           <w:tblHeader/>
         </w:trPr>
@@ -5794,12 +5347,6 @@
         </w:tc>
       </w:tr>
       <w:tr>
-        <w:tblPrEx>
-          <w:tblCellMar>
-            <w:top w:w="0" w:type="dxa"/>
-            <w:bottom w:w="0" w:type="dxa"/>
-          </w:tblCellMar>
-        </w:tblPrEx>
         <w:tc>
           <w:tcPr>
             <w:tcW w:w="2900" w:type="dxa"/>
@@ -5871,12 +5418,6 @@
         </w:tc>
       </w:tr>
       <w:tr>
-        <w:tblPrEx>
-          <w:tblCellMar>
-            <w:top w:w="0" w:type="dxa"/>
-            <w:bottom w:w="0" w:type="dxa"/>
-          </w:tblCellMar>
-        </w:tblPrEx>
         <w:tc>
           <w:tcPr>
             <w:tcW w:w="2900" w:type="dxa"/>
@@ -5948,12 +5489,6 @@
         </w:tc>
       </w:tr>
       <w:tr>
-        <w:tblPrEx>
-          <w:tblCellMar>
-            <w:top w:w="0" w:type="dxa"/>
-            <w:bottom w:w="0" w:type="dxa"/>
-          </w:tblCellMar>
-        </w:tblPrEx>
         <w:tc>
           <w:tcPr>
             <w:tcW w:w="2900" w:type="dxa"/>
@@ -6029,30 +5564,8 @@
     </w:tbl>
     <w:p>
       <w:pPr>
-        <w:pStyle w:val="Titre2"/>
-        <w:spacing w:before="300" w:after="150"/>
-      </w:pPr>
-      <w:bookmarkStart w:id="17" w:name="_Toc236664400"/>
-      <w:r>
-        <w:rPr>
-          <w:b/>
-          <w:bCs/>
-          <w:color w:val="56B039"/>
-        </w:rPr>
-        <w:t>6.3 Modèle économique envisagé</w:t>
-      </w:r>
-      <w:bookmarkEnd w:id="17"/>
-    </w:p>
-    <w:p>
-      <w:pPr>
         <w:spacing w:after="160" w:line="276" w:lineRule="auto"/>
       </w:pPr>
-      <w:r>
-        <w:rPr>
-          <w:color w:val="1F1F1F"/>
-        </w:rPr>
-        <w:t>Le modèle privilégié repose sur un partage de revenus avec l'opérateur partenaire plutôt que sur une vente directe aux utilisateurs : un service premium (« KWISMO Security+ ») serait proposé au sein de l'application de l'opérateur, celui-ci restant libre de fixer le prix, de gérer la facturation et la stratégie commerciale. KWISMO percevrait un pourcentage négocié des revenus générés. Une hypothèse de travail évoque un abonnement de l'ordre de 200 FCFA par mois, à ajuster selon la stratégie retenue par le partenaire.</w:t>
-      </w:r>
     </w:p>
     <w:p>
       <w:r>
@@ -6067,7 +5580,7 @@
         </w:pBdr>
         <w:spacing w:before="400" w:after="200"/>
       </w:pPr>
-      <w:bookmarkStart w:id="18" w:name="_Toc236664401"/>
+      <w:bookmarkStart w:id="17" w:name="_Toc237036016"/>
       <w:r>
         <w:rPr>
           <w:b/>
@@ -6077,7 +5590,7 @@
         <w:lastRenderedPageBreak/>
         <w:t>7. Livrables attendus</w:t>
       </w:r>
-      <w:bookmarkEnd w:id="18"/>
+      <w:bookmarkEnd w:id="17"/>
     </w:p>
     <w:p>
       <w:pPr>
@@ -6159,7 +5672,7 @@
         <w:pStyle w:val="Titre2"/>
         <w:spacing w:before="300" w:after="150"/>
       </w:pPr>
-      <w:bookmarkStart w:id="19" w:name="_Toc236664402"/>
+      <w:bookmarkStart w:id="18" w:name="_Toc237036017"/>
       <w:r>
         <w:rPr>
           <w:b/>
@@ -6168,7 +5681,7 @@
         </w:rPr>
         <w:t>7.1 Conception &amp; maquette</w:t>
       </w:r>
-      <w:bookmarkEnd w:id="19"/>
+      <w:bookmarkEnd w:id="18"/>
     </w:p>
     <w:p>
       <w:pPr>
@@ -6239,7 +5752,7 @@
         <w:pStyle w:val="Titre2"/>
         <w:spacing w:before="300" w:after="150"/>
       </w:pPr>
-      <w:bookmarkStart w:id="20" w:name="_Toc236664403"/>
+      <w:bookmarkStart w:id="19" w:name="_Toc237036018"/>
       <w:r>
         <w:rPr>
           <w:b/>
@@ -6248,7 +5761,7 @@
         </w:rPr>
         <w:t>7.2 Backend</w:t>
       </w:r>
-      <w:bookmarkEnd w:id="20"/>
+      <w:bookmarkEnd w:id="19"/>
     </w:p>
     <w:p>
       <w:pPr>
@@ -6399,7 +5912,7 @@
         <w:pStyle w:val="Titre2"/>
         <w:spacing w:before="300" w:after="150"/>
       </w:pPr>
-      <w:bookmarkStart w:id="21" w:name="_Toc236664404"/>
+      <w:bookmarkStart w:id="20" w:name="_Toc237036019"/>
       <w:r>
         <w:rPr>
           <w:b/>
@@ -6408,7 +5921,7 @@
         </w:rPr>
         <w:t>7.3 Modèle IA</w:t>
       </w:r>
-      <w:bookmarkEnd w:id="21"/>
+      <w:bookmarkEnd w:id="20"/>
     </w:p>
     <w:p>
       <w:pPr>
@@ -6479,7 +5992,7 @@
         <w:pStyle w:val="Titre2"/>
         <w:spacing w:before="300" w:after="150"/>
       </w:pPr>
-      <w:bookmarkStart w:id="22" w:name="_Toc236664405"/>
+      <w:bookmarkStart w:id="21" w:name="_Toc237036020"/>
       <w:r>
         <w:rPr>
           <w:b/>
@@ -6488,7 +6001,7 @@
         </w:rPr>
         <w:t>7.4 Application Web</w:t>
       </w:r>
-      <w:bookmarkEnd w:id="22"/>
+      <w:bookmarkEnd w:id="21"/>
     </w:p>
     <w:p>
       <w:pPr>
@@ -6527,7 +6040,7 @@
         <w:pStyle w:val="Titre2"/>
         <w:spacing w:before="300" w:after="150"/>
       </w:pPr>
-      <w:bookmarkStart w:id="23" w:name="_Toc236664406"/>
+      <w:bookmarkStart w:id="22" w:name="_Toc237036021"/>
       <w:r>
         <w:rPr>
           <w:b/>
@@ -6536,7 +6049,7 @@
         </w:rPr>
         <w:t>7.5 Application Mobile</w:t>
       </w:r>
-      <w:bookmarkEnd w:id="23"/>
+      <w:bookmarkEnd w:id="22"/>
     </w:p>
     <w:p>
       <w:pPr>
@@ -6664,7 +6177,7 @@
         </w:pBdr>
         <w:spacing w:before="400" w:after="200"/>
       </w:pPr>
-      <w:bookmarkStart w:id="24" w:name="_Toc236664407"/>
+      <w:bookmarkStart w:id="23" w:name="_Toc237036022"/>
       <w:r>
         <w:rPr>
           <w:b/>
@@ -6674,7 +6187,7 @@
         <w:lastRenderedPageBreak/>
         <w:t>8. Planification du projet</w:t>
       </w:r>
-      <w:bookmarkEnd w:id="24"/>
+      <w:bookmarkEnd w:id="23"/>
     </w:p>
     <w:p>
       <w:pPr>
@@ -6724,12 +6237,6 @@
         <w:gridCol w:w="5800"/>
       </w:tblGrid>
       <w:tr>
-        <w:tblPrEx>
-          <w:tblCellMar>
-            <w:top w:w="0" w:type="dxa"/>
-            <w:bottom w:w="0" w:type="dxa"/>
-          </w:tblCellMar>
-        </w:tblPrEx>
         <w:trPr>
           <w:tblHeader/>
         </w:trPr>
@@ -6810,12 +6317,6 @@
         </w:tc>
       </w:tr>
       <w:tr>
-        <w:tblPrEx>
-          <w:tblCellMar>
-            <w:top w:w="0" w:type="dxa"/>
-            <w:bottom w:w="0" w:type="dxa"/>
-          </w:tblCellMar>
-        </w:tblPrEx>
         <w:tc>
           <w:tcPr>
             <w:tcW w:w="1000" w:type="dxa"/>
@@ -6892,12 +6393,6 @@
         </w:tc>
       </w:tr>
       <w:tr>
-        <w:tblPrEx>
-          <w:tblCellMar>
-            <w:top w:w="0" w:type="dxa"/>
-            <w:bottom w:w="0" w:type="dxa"/>
-          </w:tblCellMar>
-        </w:tblPrEx>
         <w:tc>
           <w:tcPr>
             <w:tcW w:w="1000" w:type="dxa"/>
@@ -6992,12 +6487,6 @@
         </w:tc>
       </w:tr>
       <w:tr>
-        <w:tblPrEx>
-          <w:tblCellMar>
-            <w:top w:w="0" w:type="dxa"/>
-            <w:bottom w:w="0" w:type="dxa"/>
-          </w:tblCellMar>
-        </w:tblPrEx>
         <w:tc>
           <w:tcPr>
             <w:tcW w:w="1000" w:type="dxa"/>
@@ -7092,12 +6581,6 @@
         </w:tc>
       </w:tr>
       <w:tr>
-        <w:tblPrEx>
-          <w:tblCellMar>
-            <w:top w:w="0" w:type="dxa"/>
-            <w:bottom w:w="0" w:type="dxa"/>
-          </w:tblCellMar>
-        </w:tblPrEx>
         <w:tc>
           <w:tcPr>
             <w:tcW w:w="1000" w:type="dxa"/>
@@ -7174,12 +6657,6 @@
         </w:tc>
       </w:tr>
       <w:tr>
-        <w:tblPrEx>
-          <w:tblCellMar>
-            <w:top w:w="0" w:type="dxa"/>
-            <w:bottom w:w="0" w:type="dxa"/>
-          </w:tblCellMar>
-        </w:tblPrEx>
         <w:tc>
           <w:tcPr>
             <w:tcW w:w="1000" w:type="dxa"/>
@@ -7256,12 +6733,6 @@
         </w:tc>
       </w:tr>
       <w:tr>
-        <w:tblPrEx>
-          <w:tblCellMar>
-            <w:top w:w="0" w:type="dxa"/>
-            <w:bottom w:w="0" w:type="dxa"/>
-          </w:tblCellMar>
-        </w:tblPrEx>
         <w:tc>
           <w:tcPr>
             <w:tcW w:w="1000" w:type="dxa"/>
@@ -7338,12 +6809,6 @@
         </w:tc>
       </w:tr>
       <w:tr>
-        <w:tblPrEx>
-          <w:tblCellMar>
-            <w:top w:w="0" w:type="dxa"/>
-            <w:bottom w:w="0" w:type="dxa"/>
-          </w:tblCellMar>
-        </w:tblPrEx>
         <w:tc>
           <w:tcPr>
             <w:tcW w:w="1000" w:type="dxa"/>
@@ -7420,12 +6885,6 @@
         </w:tc>
       </w:tr>
       <w:tr>
-        <w:tblPrEx>
-          <w:tblCellMar>
-            <w:top w:w="0" w:type="dxa"/>
-            <w:bottom w:w="0" w:type="dxa"/>
-          </w:tblCellMar>
-        </w:tblPrEx>
         <w:tc>
           <w:tcPr>
             <w:tcW w:w="1000" w:type="dxa"/>
@@ -7502,12 +6961,6 @@
         </w:tc>
       </w:tr>
       <w:tr>
-        <w:tblPrEx>
-          <w:tblCellMar>
-            <w:top w:w="0" w:type="dxa"/>
-            <w:bottom w:w="0" w:type="dxa"/>
-          </w:tblCellMar>
-        </w:tblPrEx>
         <w:tc>
           <w:tcPr>
             <w:tcW w:w="1000" w:type="dxa"/>
@@ -7584,12 +7037,6 @@
         </w:tc>
       </w:tr>
       <w:tr>
-        <w:tblPrEx>
-          <w:tblCellMar>
-            <w:top w:w="0" w:type="dxa"/>
-            <w:bottom w:w="0" w:type="dxa"/>
-          </w:tblCellMar>
-        </w:tblPrEx>
         <w:tc>
           <w:tcPr>
             <w:tcW w:w="1000" w:type="dxa"/>
@@ -7666,12 +7113,6 @@
         </w:tc>
       </w:tr>
       <w:tr>
-        <w:tblPrEx>
-          <w:tblCellMar>
-            <w:top w:w="0" w:type="dxa"/>
-            <w:bottom w:w="0" w:type="dxa"/>
-          </w:tblCellMar>
-        </w:tblPrEx>
         <w:tc>
           <w:tcPr>
             <w:tcW w:w="1000" w:type="dxa"/>
@@ -7786,8 +7227,8 @@
       <w:proofErr w:type="spellEnd"/>
     </w:p>
     <w:sectPr>
-      <w:headerReference w:type="default" r:id="rId8"/>
-      <w:footerReference w:type="default" r:id="rId9"/>
+      <w:headerReference w:type="default" r:id="rId11"/>
+      <w:footerReference w:type="default" r:id="rId12"/>
       <w:pgSz w:w="11906" w:h="16838"/>
       <w:pgMar w:top="1000" w:right="1100" w:bottom="1000" w:left="1100" w:header="708" w:footer="708" w:gutter="0"/>
       <w:cols w:space="720"/>

</xml_diff>